<commit_message>
Modifica Contratti operazioni astah e aggiunta paragrafo test su iterazione 1
</commit_message>
<xml_diff>
--- a/Documentazione/Elaborazione/Iterazione 1/Iterazione 1.docx
+++ b/Documentazione/Elaborazione/Iterazione 1/Iterazione 1.docx
@@ -1579,21 +1579,8 @@
           <w:szCs w:val="28"/>
           <w:highlight w:val="white"/>
         </w:rPr>
-        <w:t xml:space="preserve">Configurazione e avvio partita </w:t>
-      </w:r>
-      <w:proofErr w:type="spellStart"/>
-      <w:r>
-        <w:rPr>
-          <w:rFonts w:ascii="Calibri" w:eastAsia="Calibri" w:hAnsi="Calibri" w:cs="Calibri"/>
-          <w:i/>
-          <w:color w:val="0D0D0D"/>
-          <w:sz w:val="28"/>
-          <w:szCs w:val="28"/>
-          <w:highlight w:val="white"/>
-        </w:rPr>
-        <w:t>singleplayer</w:t>
-      </w:r>
-      <w:proofErr w:type="spellEnd"/>
+        <w:t>Configurazione e avvio partita singleplayer</w:t>
+      </w:r>
       <w:r>
         <w:rPr>
           <w:rFonts w:ascii="Calibri" w:eastAsia="Calibri" w:hAnsi="Calibri" w:cs="Calibri"/>
@@ -1676,17 +1663,9 @@
         <w:rPr>
           <w:rFonts w:ascii="Calibri" w:hAnsi="Calibri" w:cs="Calibri"/>
         </w:rPr>
-        <w:t xml:space="preserve">2.0 Caso d’uso UC1: Configurazione e avvio partita </w:t>
-      </w:r>
-      <w:proofErr w:type="spellStart"/>
-      <w:r>
-        <w:rPr>
-          <w:rFonts w:ascii="Calibri" w:hAnsi="Calibri" w:cs="Calibri"/>
-        </w:rPr>
-        <w:t>singleplayer</w:t>
+        <w:t>2.0 Caso d’uso UC1: Configurazione e avvio partita singleplayer</w:t>
       </w:r>
       <w:bookmarkEnd w:id="1"/>
-      <w:proofErr w:type="spellEnd"/>
     </w:p>
     <w:p>
       <w:pPr>
@@ -1715,40 +1694,14 @@
           <w:i/>
           <w:highlight w:val="white"/>
         </w:rPr>
-        <w:t xml:space="preserve">Configurazione e avvio partita </w:t>
-      </w:r>
-      <w:proofErr w:type="spellStart"/>
-      <w:r>
-        <w:rPr>
-          <w:rFonts w:ascii="Calibri" w:hAnsi="Calibri" w:cs="Calibri"/>
-          <w:i/>
+        <w:t>Configurazione e avvio partita singleplayer</w:t>
+      </w:r>
+      <w:r>
+        <w:rPr>
+          <w:rFonts w:ascii="Calibri" w:hAnsi="Calibri" w:cs="Calibri"/>
           <w:highlight w:val="white"/>
         </w:rPr>
-        <w:t>singleplayer</w:t>
-      </w:r>
-      <w:proofErr w:type="spellEnd"/>
-      <w:r>
-        <w:rPr>
-          <w:rFonts w:ascii="Calibri" w:hAnsi="Calibri" w:cs="Calibri"/>
-          <w:highlight w:val="white"/>
-        </w:rPr>
-        <w:t xml:space="preserve">. Questo caso d’uso permette al giocatore di configurare una partita </w:t>
-      </w:r>
-      <w:proofErr w:type="spellStart"/>
-      <w:r>
-        <w:rPr>
-          <w:rFonts w:ascii="Calibri" w:hAnsi="Calibri" w:cs="Calibri"/>
-          <w:highlight w:val="white"/>
-        </w:rPr>
-        <w:t>singleplayer</w:t>
-      </w:r>
-      <w:proofErr w:type="spellEnd"/>
-      <w:r>
-        <w:rPr>
-          <w:rFonts w:ascii="Calibri" w:hAnsi="Calibri" w:cs="Calibri"/>
-          <w:highlight w:val="white"/>
-        </w:rPr>
-        <w:t xml:space="preserve"> al Gioco dell’Oca, </w:t>
+        <w:t xml:space="preserve">. Questo caso d’uso permette al giocatore di configurare una partita singleplayer al Gioco dell’Oca, </w:t>
       </w:r>
       <w:r>
         <w:rPr>
@@ -1848,16 +1801,8 @@
               <w:rPr>
                 <w:rFonts w:ascii="Calibri" w:hAnsi="Calibri" w:cs="Calibri"/>
               </w:rPr>
-              <w:t xml:space="preserve">Configurazione e avvio partita </w:t>
-            </w:r>
-            <w:proofErr w:type="spellStart"/>
-            <w:r>
-              <w:rPr>
-                <w:rFonts w:ascii="Calibri" w:hAnsi="Calibri" w:cs="Calibri"/>
-              </w:rPr>
-              <w:t>singleplayer</w:t>
-            </w:r>
-            <w:proofErr w:type="spellEnd"/>
+              <w:t>Configurazione e avvio partita singleplayer</w:t>
+            </w:r>
           </w:p>
         </w:tc>
       </w:tr>
@@ -1905,16 +1850,8 @@
               <w:rPr>
                 <w:rFonts w:ascii="Calibri" w:eastAsia="Aptos" w:hAnsi="Calibri" w:cs="Calibri"/>
               </w:rPr>
-              <w:t xml:space="preserve">UC1: Configurazione e avvio partita </w:t>
-            </w:r>
-            <w:proofErr w:type="spellStart"/>
-            <w:r>
-              <w:rPr>
-                <w:rFonts w:ascii="Calibri" w:eastAsia="Aptos" w:hAnsi="Calibri" w:cs="Calibri"/>
-              </w:rPr>
-              <w:t>singleplayer</w:t>
-            </w:r>
-            <w:proofErr w:type="spellEnd"/>
+              <w:t>UC1: Configurazione e avvio partita singleplayer</w:t>
+            </w:r>
           </w:p>
         </w:tc>
       </w:tr>
@@ -2116,21 +2053,7 @@
               <w:rPr>
                 <w:rFonts w:ascii="Calibri" w:hAnsi="Calibri" w:cs="Calibri"/>
               </w:rPr>
-              <w:t xml:space="preserve">Giocatore → Vuole configurare e avviare una partita </w:t>
-            </w:r>
-            <w:proofErr w:type="spellStart"/>
-            <w:r>
-              <w:rPr>
-                <w:rFonts w:ascii="Calibri" w:hAnsi="Calibri" w:cs="Calibri"/>
-              </w:rPr>
-              <w:t>singleplayer</w:t>
-            </w:r>
-            <w:proofErr w:type="spellEnd"/>
-            <w:r>
-              <w:rPr>
-                <w:rFonts w:ascii="Calibri" w:hAnsi="Calibri" w:cs="Calibri"/>
-              </w:rPr>
-              <w:t>, scegliendo regole e personalizzazioni</w:t>
+              <w:t>Giocatore → Vuole configurare e avviare una partita singleplayer, scegliendo regole e personalizzazioni</w:t>
             </w:r>
           </w:p>
           <w:p>
@@ -2293,39 +2216,7 @@
                 <w:rFonts w:ascii="Calibri" w:eastAsia="Calibri" w:hAnsi="Calibri" w:cs="Calibri"/>
                 <w:highlight w:val="white"/>
               </w:rPr>
-              <w:t xml:space="preserve">Il giocatore vuole avviare una partita </w:t>
-            </w:r>
-            <w:proofErr w:type="spellStart"/>
-            <w:r>
-              <w:rPr>
-                <w:rFonts w:ascii="Calibri" w:eastAsia="Calibri" w:hAnsi="Calibri" w:cs="Calibri"/>
-                <w:highlight w:val="white"/>
-              </w:rPr>
-              <w:t>singleplayer</w:t>
-            </w:r>
-            <w:proofErr w:type="spellEnd"/>
-            <w:r>
-              <w:rPr>
-                <w:rFonts w:ascii="Calibri" w:eastAsia="Calibri" w:hAnsi="Calibri" w:cs="Calibri"/>
-                <w:highlight w:val="white"/>
-              </w:rPr>
-              <w:t xml:space="preserve"> cliccando il pulsante “Nuova Partita </w:t>
-            </w:r>
-            <w:proofErr w:type="spellStart"/>
-            <w:r>
-              <w:rPr>
-                <w:rFonts w:ascii="Calibri" w:eastAsia="Calibri" w:hAnsi="Calibri" w:cs="Calibri"/>
-                <w:highlight w:val="white"/>
-              </w:rPr>
-              <w:t>Singleplayer</w:t>
-            </w:r>
-            <w:proofErr w:type="spellEnd"/>
-            <w:r>
-              <w:rPr>
-                <w:rFonts w:ascii="Calibri" w:eastAsia="Calibri" w:hAnsi="Calibri" w:cs="Calibri"/>
-                <w:highlight w:val="white"/>
-              </w:rPr>
-              <w:t>”.</w:t>
+              <w:t>Il giocatore vuole avviare una partita singleplayer cliccando il pulsante “Nuova Partita Singleplayer”.</w:t>
             </w:r>
           </w:p>
           <w:p>
@@ -3091,21 +2982,7 @@
               <w:rPr>
                 <w:rFonts w:ascii="Calibri" w:hAnsi="Calibri" w:cs="Calibri"/>
               </w:rPr>
-              <w:t xml:space="preserve">Dipende dal numero di partite </w:t>
-            </w:r>
-            <w:proofErr w:type="spellStart"/>
-            <w:r>
-              <w:rPr>
-                <w:rFonts w:ascii="Calibri" w:hAnsi="Calibri" w:cs="Calibri"/>
-              </w:rPr>
-              <w:t>singleplayer</w:t>
-            </w:r>
-            <w:proofErr w:type="spellEnd"/>
-            <w:r>
-              <w:rPr>
-                <w:rFonts w:ascii="Calibri" w:hAnsi="Calibri" w:cs="Calibri"/>
-              </w:rPr>
-              <w:t xml:space="preserve"> che il giocatore vuole avviare</w:t>
+              <w:t>Dipende dal numero di partite singleplayer che il giocatore vuole avviare</w:t>
             </w:r>
           </w:p>
         </w:tc>
@@ -3360,7 +3237,6 @@
         </w:rPr>
         <w:t xml:space="preserve">• </w:t>
       </w:r>
-      <w:proofErr w:type="spellStart"/>
       <w:r>
         <w:rPr>
           <w:rFonts w:ascii="Calibri" w:hAnsi="Calibri" w:cs="Calibri"/>
@@ -3377,7 +3253,6 @@
         </w:rPr>
         <w:t>DellOca</w:t>
       </w:r>
-      <w:proofErr w:type="spellEnd"/>
       <w:r>
         <w:rPr>
           <w:rFonts w:ascii="Calibri" w:hAnsi="Calibri" w:cs="Calibri"/>
@@ -3600,7 +3475,6 @@
         </w:rPr>
         <w:t xml:space="preserve"> definita da </w:t>
       </w:r>
-      <w:proofErr w:type="spellStart"/>
       <w:r>
         <w:rPr>
           <w:rFonts w:ascii="Calibri" w:hAnsi="Calibri" w:cs="Calibri"/>
@@ -3610,7 +3484,6 @@
         </w:rPr>
         <w:t>TipologiaPersonalizzazione</w:t>
       </w:r>
-      <w:proofErr w:type="spellEnd"/>
       <w:r>
         <w:rPr>
           <w:rFonts w:ascii="Calibri" w:hAnsi="Calibri" w:cs="Calibri"/>
@@ -3653,7 +3526,7 @@
           <w:szCs w:val="28"/>
         </w:rPr>
         <w:drawing>
-          <wp:inline distT="0" distB="0" distL="0" distR="0" wp14:anchorId="4989D762" wp14:editId="6596DD61">
+          <wp:inline distT="0" distB="0" distL="0" distR="0" wp14:anchorId="4989D762" wp14:editId="60ABFE5F">
             <wp:extent cx="6120130" cy="3266440"/>
             <wp:effectExtent l="0" t="0" r="0" b="0"/>
             <wp:docPr id="118063030" name="Immagine 2" descr="Immagine che contiene testo, schermata, diagramma, linea"/>
@@ -3946,7 +3819,6 @@
                 <w:i/>
               </w:rPr>
             </w:pPr>
-            <w:proofErr w:type="spellStart"/>
             <w:r>
               <w:rPr>
                 <w:rFonts w:ascii="Calibri" w:eastAsia="Aptos" w:hAnsi="Calibri" w:cs="Calibri"/>
@@ -3969,7 +3841,6 @@
               </w:rPr>
               <w:t>onfiguraNuovaPartitaSP</w:t>
             </w:r>
-            <w:proofErr w:type="spellEnd"/>
           </w:p>
         </w:tc>
       </w:tr>
@@ -4011,19 +3882,11 @@
                 <w:rFonts w:ascii="Calibri" w:eastAsia="Aptos" w:hAnsi="Calibri" w:cs="Calibri"/>
               </w:rPr>
             </w:pPr>
-            <w:proofErr w:type="spellStart"/>
-            <w:r>
-              <w:rPr>
-                <w:rFonts w:ascii="Calibri" w:eastAsia="Aptos" w:hAnsi="Calibri" w:cs="Calibri"/>
-              </w:rPr>
-              <w:t>configuraNuovaPartitaSP</w:t>
-            </w:r>
-            <w:proofErr w:type="spellEnd"/>
-            <w:r>
-              <w:rPr>
-                <w:rFonts w:ascii="Calibri" w:eastAsia="Aptos" w:hAnsi="Calibri" w:cs="Calibri"/>
-              </w:rPr>
-              <w:t xml:space="preserve"> ();</w:t>
+            <w:r>
+              <w:rPr>
+                <w:rFonts w:ascii="Calibri" w:eastAsia="Aptos" w:hAnsi="Calibri" w:cs="Calibri"/>
+              </w:rPr>
+              <w:t>configuraNuovaPartitaSP ();</w:t>
             </w:r>
           </w:p>
         </w:tc>
@@ -4069,21 +3932,7 @@
               <w:rPr>
                 <w:rFonts w:ascii="Calibri" w:hAnsi="Calibri" w:cs="Calibri"/>
               </w:rPr>
-              <w:t xml:space="preserve">Caso d’uso UC1: Configurazione e avvio partita </w:t>
-            </w:r>
-            <w:proofErr w:type="spellStart"/>
-            <w:r>
-              <w:rPr>
-                <w:rFonts w:ascii="Calibri" w:hAnsi="Calibri" w:cs="Calibri"/>
-              </w:rPr>
-              <w:t>singleplayer</w:t>
-            </w:r>
-            <w:proofErr w:type="spellEnd"/>
-            <w:r>
-              <w:rPr>
-                <w:rFonts w:ascii="Calibri" w:hAnsi="Calibri" w:cs="Calibri"/>
-              </w:rPr>
-              <w:t>;</w:t>
+              <w:t>Caso d’uso UC1: Configurazione e avvio partita singleplayer;</w:t>
             </w:r>
           </w:p>
         </w:tc>
@@ -4275,7 +4124,6 @@
               </w:rPr>
               <w:t xml:space="preserve"> è stato associato a </w:t>
             </w:r>
-            <w:proofErr w:type="spellStart"/>
             <w:r>
               <w:rPr>
                 <w:rFonts w:ascii="Calibri" w:hAnsi="Calibri" w:cs="Calibri"/>
@@ -4283,7 +4131,6 @@
               </w:rPr>
               <w:t>GiocoDellOca</w:t>
             </w:r>
-            <w:proofErr w:type="spellEnd"/>
             <w:r>
               <w:rPr>
                 <w:rFonts w:ascii="Calibri" w:hAnsi="Calibri" w:cs="Calibri"/>
@@ -4395,7 +4242,6 @@
                 <w:iCs/>
               </w:rPr>
             </w:pPr>
-            <w:proofErr w:type="spellStart"/>
             <w:r>
               <w:rPr>
                 <w:rFonts w:ascii="Calibri" w:eastAsia="Aptos" w:hAnsi="Calibri" w:cs="Calibri"/>
@@ -4422,7 +4268,6 @@
               </w:rPr>
               <w:t>tRegolaSingola</w:t>
             </w:r>
-            <w:proofErr w:type="spellEnd"/>
           </w:p>
         </w:tc>
       </w:tr>
@@ -4464,47 +4309,11 @@
                 <w:rFonts w:ascii="Calibri" w:eastAsia="Aptos" w:hAnsi="Calibri" w:cs="Calibri"/>
               </w:rPr>
             </w:pPr>
-            <w:proofErr w:type="spellStart"/>
-            <w:r>
-              <w:rPr>
-                <w:rFonts w:ascii="Calibri" w:eastAsia="Aptos" w:hAnsi="Calibri" w:cs="Calibri"/>
-              </w:rPr>
-              <w:t>setRegolaSingola</w:t>
-            </w:r>
-            <w:proofErr w:type="spellEnd"/>
-            <w:r>
-              <w:rPr>
-                <w:rFonts w:ascii="Calibri" w:eastAsia="Aptos" w:hAnsi="Calibri" w:cs="Calibri"/>
-              </w:rPr>
-              <w:t xml:space="preserve"> (</w:t>
-            </w:r>
-            <w:proofErr w:type="spellStart"/>
-            <w:r>
-              <w:rPr>
-                <w:rFonts w:ascii="Calibri" w:eastAsia="Aptos" w:hAnsi="Calibri" w:cs="Calibri"/>
-              </w:rPr>
-              <w:t>codiceRegola</w:t>
-            </w:r>
-            <w:proofErr w:type="spellEnd"/>
-            <w:r>
-              <w:rPr>
-                <w:rFonts w:ascii="Calibri" w:eastAsia="Aptos" w:hAnsi="Calibri" w:cs="Calibri"/>
-              </w:rPr>
-              <w:t xml:space="preserve">, </w:t>
-            </w:r>
-            <w:proofErr w:type="spellStart"/>
-            <w:r>
-              <w:rPr>
-                <w:rFonts w:ascii="Calibri" w:eastAsia="Aptos" w:hAnsi="Calibri" w:cs="Calibri"/>
-              </w:rPr>
-              <w:t>proprietaRegola</w:t>
-            </w:r>
-            <w:proofErr w:type="spellEnd"/>
-            <w:r>
-              <w:rPr>
-                <w:rFonts w:ascii="Calibri" w:eastAsia="Aptos" w:hAnsi="Calibri" w:cs="Calibri"/>
-              </w:rPr>
-              <w:t>)</w:t>
+            <w:r>
+              <w:rPr>
+                <w:rFonts w:ascii="Calibri" w:eastAsia="Aptos" w:hAnsi="Calibri" w:cs="Calibri"/>
+              </w:rPr>
+              <w:t>setRegolaSingola (codiceRegola, proprietaRegola)</w:t>
             </w:r>
           </w:p>
         </w:tc>
@@ -4550,21 +4359,7 @@
               <w:rPr>
                 <w:rFonts w:ascii="Calibri" w:hAnsi="Calibri" w:cs="Calibri"/>
               </w:rPr>
-              <w:t xml:space="preserve">Caso d’uso UC1: Configurazione e avvio partita </w:t>
-            </w:r>
-            <w:proofErr w:type="spellStart"/>
-            <w:r>
-              <w:rPr>
-                <w:rFonts w:ascii="Calibri" w:hAnsi="Calibri" w:cs="Calibri"/>
-              </w:rPr>
-              <w:t>singleplayer</w:t>
-            </w:r>
-            <w:proofErr w:type="spellEnd"/>
-            <w:r>
-              <w:rPr>
-                <w:rFonts w:ascii="Calibri" w:hAnsi="Calibri" w:cs="Calibri"/>
-              </w:rPr>
-              <w:t>;</w:t>
+              <w:t>Caso d’uso UC1: Configurazione e avvio partita singleplayer;</w:t>
             </w:r>
           </w:p>
         </w:tc>
@@ -4639,17 +4434,8 @@
                 <w:rFonts w:ascii="Calibri" w:hAnsi="Calibri" w:cs="Calibri"/>
                 <w:i/>
               </w:rPr>
-              <w:t xml:space="preserve"> </w:t>
-            </w:r>
-            <w:proofErr w:type="spellStart"/>
-            <w:r>
-              <w:rPr>
-                <w:rFonts w:ascii="Calibri" w:hAnsi="Calibri" w:cs="Calibri"/>
-                <w:i/>
-              </w:rPr>
-              <w:t>GiocoDell’Oca</w:t>
-            </w:r>
-            <w:proofErr w:type="spellEnd"/>
+              <w:t xml:space="preserve"> GiocoDell’Oca</w:t>
+            </w:r>
             <w:r>
               <w:rPr>
                 <w:rFonts w:ascii="Calibri" w:hAnsi="Calibri" w:cs="Calibri"/>
@@ -4676,8 +4462,6 @@
               </w:rPr>
               <w:t xml:space="preserve">è selezionata la </w:t>
             </w:r>
-            <w:proofErr w:type="spellStart"/>
-            <w:proofErr w:type="gramStart"/>
             <w:r>
               <w:rPr>
                 <w:rFonts w:ascii="Calibri" w:hAnsi="Calibri" w:cs="Calibri"/>
@@ -4686,15 +4470,12 @@
               </w:rPr>
               <w:t>tipologiaRegole</w:t>
             </w:r>
-            <w:proofErr w:type="spellEnd"/>
-            <w:proofErr w:type="gramEnd"/>
             <w:r>
               <w:rPr>
                 <w:rFonts w:ascii="Calibri" w:hAnsi="Calibri" w:cs="Calibri"/>
               </w:rPr>
               <w:t xml:space="preserve"> corrispondente a </w:t>
             </w:r>
-            <w:proofErr w:type="spellStart"/>
             <w:r>
               <w:rPr>
                 <w:rFonts w:ascii="Calibri" w:hAnsi="Calibri" w:cs="Calibri"/>
@@ -4703,7 +4484,6 @@
               </w:rPr>
               <w:t>RegolaSingola</w:t>
             </w:r>
-            <w:proofErr w:type="spellEnd"/>
             <w:r>
               <w:rPr>
                 <w:rFonts w:ascii="Calibri" w:hAnsi="Calibri" w:cs="Calibri"/>
@@ -4902,7 +4682,6 @@
                 <w:color w:val="0070C0"/>
               </w:rPr>
             </w:pPr>
-            <w:proofErr w:type="spellStart"/>
             <w:r>
               <w:rPr>
                 <w:rFonts w:ascii="Calibri" w:eastAsia="Aptos" w:hAnsi="Calibri" w:cs="Calibri"/>
@@ -4955,7 +4734,6 @@
               </w:rPr>
               <w:t>SetPredefinito</w:t>
             </w:r>
-            <w:proofErr w:type="spellEnd"/>
           </w:p>
         </w:tc>
       </w:tr>
@@ -4997,33 +4775,11 @@
                 <w:rFonts w:ascii="Calibri" w:eastAsia="Aptos" w:hAnsi="Calibri" w:cs="Calibri"/>
               </w:rPr>
             </w:pPr>
-            <w:proofErr w:type="spellStart"/>
-            <w:r>
-              <w:rPr>
-                <w:rFonts w:ascii="Calibri" w:eastAsia="Aptos" w:hAnsi="Calibri" w:cs="Calibri"/>
-              </w:rPr>
-              <w:t>setRegolaSetPredefinito</w:t>
-            </w:r>
-            <w:proofErr w:type="spellEnd"/>
-            <w:r>
-              <w:rPr>
-                <w:rFonts w:ascii="Calibri" w:eastAsia="Aptos" w:hAnsi="Calibri" w:cs="Calibri"/>
-              </w:rPr>
-              <w:t>(</w:t>
-            </w:r>
-            <w:proofErr w:type="spellStart"/>
-            <w:r>
-              <w:rPr>
-                <w:rFonts w:ascii="Calibri" w:eastAsia="Aptos" w:hAnsi="Calibri" w:cs="Calibri"/>
-              </w:rPr>
-              <w:t>codiceRegolaSet</w:t>
-            </w:r>
-            <w:proofErr w:type="spellEnd"/>
-            <w:r>
-              <w:rPr>
-                <w:rFonts w:ascii="Calibri" w:eastAsia="Aptos" w:hAnsi="Calibri" w:cs="Calibri"/>
-              </w:rPr>
-              <w:t>)</w:t>
+            <w:r>
+              <w:rPr>
+                <w:rFonts w:ascii="Calibri" w:eastAsia="Aptos" w:hAnsi="Calibri" w:cs="Calibri"/>
+              </w:rPr>
+              <w:t>setRegolaSetPredefinito(codiceRegolaSet)</w:t>
             </w:r>
           </w:p>
         </w:tc>
@@ -5069,21 +4825,7 @@
               <w:rPr>
                 <w:rFonts w:ascii="Calibri" w:hAnsi="Calibri" w:cs="Calibri"/>
               </w:rPr>
-              <w:t xml:space="preserve">Caso d’uso UC1: Configurazione e avvio partita </w:t>
-            </w:r>
-            <w:proofErr w:type="spellStart"/>
-            <w:r>
-              <w:rPr>
-                <w:rFonts w:ascii="Calibri" w:hAnsi="Calibri" w:cs="Calibri"/>
-              </w:rPr>
-              <w:t>singleplayer</w:t>
-            </w:r>
-            <w:proofErr w:type="spellEnd"/>
-            <w:r>
-              <w:rPr>
-                <w:rFonts w:ascii="Calibri" w:hAnsi="Calibri" w:cs="Calibri"/>
-              </w:rPr>
-              <w:t>;</w:t>
+              <w:t>Caso d’uso UC1: Configurazione e avvio partita singleplayer;</w:t>
             </w:r>
           </w:p>
         </w:tc>
@@ -5151,17 +4893,8 @@
                 <w:rFonts w:ascii="Calibri" w:hAnsi="Calibri" w:cs="Calibri"/>
                 <w:i/>
               </w:rPr>
-              <w:t xml:space="preserve"> </w:t>
-            </w:r>
-            <w:proofErr w:type="spellStart"/>
-            <w:r>
-              <w:rPr>
-                <w:rFonts w:ascii="Calibri" w:hAnsi="Calibri" w:cs="Calibri"/>
-                <w:i/>
-              </w:rPr>
-              <w:t>GiocoDell’Oca</w:t>
-            </w:r>
-            <w:proofErr w:type="spellEnd"/>
+              <w:t xml:space="preserve"> GiocoDell’Oca</w:t>
+            </w:r>
             <w:r>
               <w:rPr>
                 <w:rFonts w:ascii="Calibri" w:hAnsi="Calibri" w:cs="Calibri"/>
@@ -5182,8 +4915,6 @@
               </w:rPr>
               <w:t xml:space="preserve">- Si è selezionata la </w:t>
             </w:r>
-            <w:proofErr w:type="spellStart"/>
-            <w:proofErr w:type="gramStart"/>
             <w:r>
               <w:rPr>
                 <w:rFonts w:ascii="Calibri" w:hAnsi="Calibri" w:cs="Calibri"/>
@@ -5192,15 +4923,12 @@
               </w:rPr>
               <w:t>tipologiaRegole</w:t>
             </w:r>
-            <w:proofErr w:type="spellEnd"/>
-            <w:proofErr w:type="gramEnd"/>
             <w:r>
               <w:rPr>
                 <w:rFonts w:ascii="Calibri" w:hAnsi="Calibri" w:cs="Calibri"/>
               </w:rPr>
               <w:t xml:space="preserve"> corrispondente a </w:t>
             </w:r>
-            <w:proofErr w:type="spellStart"/>
             <w:r>
               <w:rPr>
                 <w:rFonts w:ascii="Calibri" w:hAnsi="Calibri" w:cs="Calibri"/>
@@ -5209,7 +4937,6 @@
               </w:rPr>
               <w:t>SetDiRegole</w:t>
             </w:r>
-            <w:proofErr w:type="spellEnd"/>
             <w:r>
               <w:rPr>
                 <w:rFonts w:ascii="Calibri" w:hAnsi="Calibri" w:cs="Calibri"/>
@@ -5406,7 +5133,6 @@
                 <w:iCs/>
               </w:rPr>
             </w:pPr>
-            <w:proofErr w:type="spellStart"/>
             <w:r>
               <w:rPr>
                 <w:rFonts w:ascii="Calibri" w:eastAsia="Aptos" w:hAnsi="Calibri" w:cs="Calibri"/>
@@ -5433,7 +5159,6 @@
               </w:rPr>
               <w:t>tScenario</w:t>
             </w:r>
-            <w:proofErr w:type="spellEnd"/>
           </w:p>
         </w:tc>
       </w:tr>
@@ -5475,33 +5200,11 @@
                 <w:rFonts w:ascii="Calibri" w:eastAsia="Aptos" w:hAnsi="Calibri" w:cs="Calibri"/>
               </w:rPr>
             </w:pPr>
-            <w:proofErr w:type="spellStart"/>
-            <w:r>
-              <w:rPr>
-                <w:rFonts w:ascii="Calibri" w:eastAsia="Aptos" w:hAnsi="Calibri" w:cs="Calibri"/>
-              </w:rPr>
-              <w:t>setScenario</w:t>
-            </w:r>
-            <w:proofErr w:type="spellEnd"/>
-            <w:r>
-              <w:rPr>
-                <w:rFonts w:ascii="Calibri" w:eastAsia="Aptos" w:hAnsi="Calibri" w:cs="Calibri"/>
-              </w:rPr>
-              <w:t xml:space="preserve"> (</w:t>
-            </w:r>
-            <w:proofErr w:type="spellStart"/>
-            <w:r>
-              <w:rPr>
-                <w:rFonts w:ascii="Calibri" w:eastAsia="Aptos" w:hAnsi="Calibri" w:cs="Calibri"/>
-              </w:rPr>
-              <w:t>codiceScenario</w:t>
-            </w:r>
-            <w:proofErr w:type="spellEnd"/>
-            <w:r>
-              <w:rPr>
-                <w:rFonts w:ascii="Calibri" w:eastAsia="Aptos" w:hAnsi="Calibri" w:cs="Calibri"/>
-              </w:rPr>
-              <w:t>)</w:t>
+            <w:r>
+              <w:rPr>
+                <w:rFonts w:ascii="Calibri" w:eastAsia="Aptos" w:hAnsi="Calibri" w:cs="Calibri"/>
+              </w:rPr>
+              <w:t>setScenario (codiceScenario)</w:t>
             </w:r>
           </w:p>
         </w:tc>
@@ -5547,21 +5250,7 @@
               <w:rPr>
                 <w:rFonts w:ascii="Calibri" w:hAnsi="Calibri" w:cs="Calibri"/>
               </w:rPr>
-              <w:t xml:space="preserve">Caso d’uso UC1: Configurazione e avvio partita </w:t>
-            </w:r>
-            <w:proofErr w:type="spellStart"/>
-            <w:r>
-              <w:rPr>
-                <w:rFonts w:ascii="Calibri" w:hAnsi="Calibri" w:cs="Calibri"/>
-              </w:rPr>
-              <w:t>singleplayer</w:t>
-            </w:r>
-            <w:proofErr w:type="spellEnd"/>
-            <w:r>
-              <w:rPr>
-                <w:rFonts w:ascii="Calibri" w:hAnsi="Calibri" w:cs="Calibri"/>
-              </w:rPr>
-              <w:t>;</w:t>
+              <w:t>Caso d’uso UC1: Configurazione e avvio partita singleplayer;</w:t>
             </w:r>
           </w:p>
         </w:tc>
@@ -5629,17 +5318,8 @@
                 <w:rFonts w:ascii="Calibri" w:hAnsi="Calibri" w:cs="Calibri"/>
                 <w:i/>
               </w:rPr>
-              <w:t xml:space="preserve"> </w:t>
-            </w:r>
-            <w:proofErr w:type="spellStart"/>
-            <w:r>
-              <w:rPr>
-                <w:rFonts w:ascii="Calibri" w:hAnsi="Calibri" w:cs="Calibri"/>
-                <w:i/>
-              </w:rPr>
-              <w:t>GiocoDell’Oca</w:t>
-            </w:r>
-            <w:proofErr w:type="spellEnd"/>
+              <w:t xml:space="preserve"> GiocoDell’Oca</w:t>
+            </w:r>
             <w:r>
               <w:rPr>
                 <w:rFonts w:ascii="Calibri" w:hAnsi="Calibri" w:cs="Calibri"/>
@@ -5877,7 +5557,6 @@
                 <w:iCs/>
               </w:rPr>
             </w:pPr>
-            <w:proofErr w:type="spellStart"/>
             <w:r>
               <w:rPr>
                 <w:rFonts w:ascii="Calibri" w:eastAsia="Aptos" w:hAnsi="Calibri" w:cs="Calibri"/>
@@ -5904,7 +5583,6 @@
               </w:rPr>
               <w:t>tDado</w:t>
             </w:r>
-            <w:proofErr w:type="spellEnd"/>
           </w:p>
         </w:tc>
       </w:tr>
@@ -5946,7 +5624,6 @@
                 <w:rFonts w:ascii="Calibri" w:eastAsia="Aptos" w:hAnsi="Calibri" w:cs="Calibri"/>
               </w:rPr>
             </w:pPr>
-            <w:proofErr w:type="spellStart"/>
             <w:r>
               <w:rPr>
                 <w:rFonts w:ascii="Calibri" w:eastAsia="Aptos" w:hAnsi="Calibri" w:cs="Calibri"/>
@@ -5959,21 +5636,18 @@
               </w:rPr>
               <w:t>tDado</w:t>
             </w:r>
-            <w:proofErr w:type="spellEnd"/>
             <w:r>
               <w:rPr>
                 <w:rFonts w:ascii="Calibri" w:eastAsia="Aptos" w:hAnsi="Calibri" w:cs="Calibri"/>
               </w:rPr>
               <w:t>(</w:t>
             </w:r>
-            <w:proofErr w:type="spellStart"/>
             <w:r>
               <w:rPr>
                 <w:rFonts w:ascii="Calibri" w:eastAsia="Aptos" w:hAnsi="Calibri" w:cs="Calibri"/>
               </w:rPr>
               <w:t>codiceDado</w:t>
             </w:r>
-            <w:proofErr w:type="spellEnd"/>
             <w:r>
               <w:rPr>
                 <w:rFonts w:ascii="Calibri" w:eastAsia="Aptos" w:hAnsi="Calibri" w:cs="Calibri"/>
@@ -6024,21 +5698,7 @@
               <w:rPr>
                 <w:rFonts w:ascii="Calibri" w:hAnsi="Calibri" w:cs="Calibri"/>
               </w:rPr>
-              <w:t xml:space="preserve">Caso d’uso UC1: Configurazione e avvio partita </w:t>
-            </w:r>
-            <w:proofErr w:type="spellStart"/>
-            <w:r>
-              <w:rPr>
-                <w:rFonts w:ascii="Calibri" w:hAnsi="Calibri" w:cs="Calibri"/>
-              </w:rPr>
-              <w:t>singleplayer</w:t>
-            </w:r>
-            <w:proofErr w:type="spellEnd"/>
-            <w:r>
-              <w:rPr>
-                <w:rFonts w:ascii="Calibri" w:hAnsi="Calibri" w:cs="Calibri"/>
-              </w:rPr>
-              <w:t>;</w:t>
+              <w:t>Caso d’uso UC1: Configurazione e avvio partita singleplayer;</w:t>
             </w:r>
           </w:p>
         </w:tc>
@@ -6106,17 +5766,8 @@
                 <w:rFonts w:ascii="Calibri" w:hAnsi="Calibri" w:cs="Calibri"/>
                 <w:i/>
               </w:rPr>
-              <w:t xml:space="preserve"> </w:t>
-            </w:r>
-            <w:proofErr w:type="spellStart"/>
-            <w:r>
-              <w:rPr>
-                <w:rFonts w:ascii="Calibri" w:hAnsi="Calibri" w:cs="Calibri"/>
-                <w:i/>
-              </w:rPr>
-              <w:t>GiocoDell’Oca</w:t>
-            </w:r>
-            <w:proofErr w:type="spellEnd"/>
+              <w:t xml:space="preserve"> GiocoDell’Oca</w:t>
+            </w:r>
             <w:r>
               <w:rPr>
                 <w:rFonts w:ascii="Calibri" w:hAnsi="Calibri" w:cs="Calibri"/>
@@ -6232,7 +5883,6 @@
               </w:rPr>
               <w:t xml:space="preserve"> con la </w:t>
             </w:r>
-            <w:proofErr w:type="spellStart"/>
             <w:r>
               <w:rPr>
                 <w:rFonts w:ascii="Calibri" w:hAnsi="Calibri" w:cs="Calibri"/>
@@ -6241,7 +5891,6 @@
               </w:rPr>
               <w:t>tipologiaPersonalizzazione</w:t>
             </w:r>
-            <w:proofErr w:type="spellEnd"/>
             <w:r>
               <w:rPr>
                 <w:rFonts w:ascii="Calibri" w:hAnsi="Calibri" w:cs="Calibri"/>
@@ -6294,8 +5943,6 @@
               </w:rPr>
               <w:t xml:space="preserve">- È stata creata una nuova istanza </w:t>
             </w:r>
-            <w:proofErr w:type="spellStart"/>
-            <w:proofErr w:type="gramStart"/>
             <w:r>
               <w:rPr>
                 <w:rFonts w:ascii="Calibri" w:hAnsi="Calibri" w:cs="Calibri"/>
@@ -6310,8 +5957,6 @@
               </w:rPr>
               <w:t>Dado</w:t>
             </w:r>
-            <w:proofErr w:type="spellEnd"/>
-            <w:proofErr w:type="gramEnd"/>
             <w:r>
               <w:rPr>
                 <w:rFonts w:ascii="Calibri" w:hAnsi="Calibri" w:cs="Calibri"/>
@@ -6345,8 +5990,6 @@
               </w:rPr>
               <w:t xml:space="preserve">- Gli attributi di </w:t>
             </w:r>
-            <w:proofErr w:type="spellStart"/>
-            <w:proofErr w:type="gramStart"/>
             <w:r>
               <w:rPr>
                 <w:rFonts w:ascii="Calibri" w:hAnsi="Calibri" w:cs="Calibri"/>
@@ -6361,8 +6004,6 @@
               </w:rPr>
               <w:t>Dado</w:t>
             </w:r>
-            <w:proofErr w:type="spellEnd"/>
-            <w:proofErr w:type="gramEnd"/>
             <w:r>
               <w:rPr>
                 <w:rFonts w:ascii="Calibri" w:hAnsi="Calibri" w:cs="Calibri"/>
@@ -6460,7 +6101,6 @@
                 <w:iCs/>
               </w:rPr>
             </w:pPr>
-            <w:proofErr w:type="spellStart"/>
             <w:r>
               <w:rPr>
                 <w:rFonts w:ascii="Calibri" w:eastAsia="Aptos" w:hAnsi="Calibri" w:cs="Calibri"/>
@@ -6487,7 +6127,6 @@
               </w:rPr>
               <w:t>tPedina</w:t>
             </w:r>
-            <w:proofErr w:type="spellEnd"/>
           </w:p>
         </w:tc>
       </w:tr>
@@ -6529,7 +6168,6 @@
                 <w:rFonts w:ascii="Calibri" w:eastAsia="Aptos" w:hAnsi="Calibri" w:cs="Calibri"/>
               </w:rPr>
             </w:pPr>
-            <w:proofErr w:type="spellStart"/>
             <w:r>
               <w:rPr>
                 <w:rFonts w:ascii="Calibri" w:eastAsia="Aptos" w:hAnsi="Calibri" w:cs="Calibri"/>
@@ -6542,14 +6180,12 @@
               </w:rPr>
               <w:t>tPedina</w:t>
             </w:r>
-            <w:proofErr w:type="spellEnd"/>
             <w:r>
               <w:rPr>
                 <w:rFonts w:ascii="Calibri" w:eastAsia="Aptos" w:hAnsi="Calibri" w:cs="Calibri"/>
               </w:rPr>
               <w:t>(</w:t>
             </w:r>
-            <w:proofErr w:type="spellStart"/>
             <w:r>
               <w:rPr>
                 <w:rFonts w:ascii="Calibri" w:eastAsia="Aptos" w:hAnsi="Calibri" w:cs="Calibri"/>
@@ -6568,7 +6204,6 @@
               </w:rPr>
               <w:t>dina</w:t>
             </w:r>
-            <w:proofErr w:type="spellEnd"/>
             <w:r>
               <w:rPr>
                 <w:rFonts w:ascii="Calibri" w:eastAsia="Aptos" w:hAnsi="Calibri" w:cs="Calibri"/>
@@ -6619,21 +6254,7 @@
               <w:rPr>
                 <w:rFonts w:ascii="Calibri" w:hAnsi="Calibri" w:cs="Calibri"/>
               </w:rPr>
-              <w:t xml:space="preserve">Caso d’uso UC1: Configurazione e avvio partita </w:t>
-            </w:r>
-            <w:proofErr w:type="spellStart"/>
-            <w:r>
-              <w:rPr>
-                <w:rFonts w:ascii="Calibri" w:hAnsi="Calibri" w:cs="Calibri"/>
-              </w:rPr>
-              <w:t>singleplayer</w:t>
-            </w:r>
-            <w:proofErr w:type="spellEnd"/>
-            <w:r>
-              <w:rPr>
-                <w:rFonts w:ascii="Calibri" w:hAnsi="Calibri" w:cs="Calibri"/>
-              </w:rPr>
-              <w:t>;</w:t>
+              <w:t>Caso d’uso UC1: Configurazione e avvio partita singleplayer;</w:t>
             </w:r>
           </w:p>
         </w:tc>
@@ -6701,17 +6322,8 @@
                 <w:rFonts w:ascii="Calibri" w:hAnsi="Calibri" w:cs="Calibri"/>
                 <w:i/>
               </w:rPr>
-              <w:t xml:space="preserve"> </w:t>
-            </w:r>
-            <w:proofErr w:type="spellStart"/>
-            <w:r>
-              <w:rPr>
-                <w:rFonts w:ascii="Calibri" w:hAnsi="Calibri" w:cs="Calibri"/>
-                <w:i/>
-              </w:rPr>
-              <w:t>GiocoDell’Oca</w:t>
-            </w:r>
-            <w:proofErr w:type="spellEnd"/>
+              <w:t xml:space="preserve"> GiocoDell’Oca</w:t>
+            </w:r>
             <w:r>
               <w:rPr>
                 <w:rFonts w:ascii="Calibri" w:hAnsi="Calibri" w:cs="Calibri"/>
@@ -6827,7 +6439,6 @@
               </w:rPr>
               <w:t xml:space="preserve"> con la </w:t>
             </w:r>
-            <w:proofErr w:type="spellStart"/>
             <w:r>
               <w:rPr>
                 <w:rFonts w:ascii="Calibri" w:hAnsi="Calibri" w:cs="Calibri"/>
@@ -6836,7 +6447,6 @@
               </w:rPr>
               <w:t>tipologiaPersonalizzazione</w:t>
             </w:r>
-            <w:proofErr w:type="spellEnd"/>
             <w:r>
               <w:rPr>
                 <w:rFonts w:ascii="Calibri" w:hAnsi="Calibri" w:cs="Calibri"/>
@@ -6889,8 +6499,6 @@
               </w:rPr>
               <w:t xml:space="preserve">- È stata creata una nuova istanza </w:t>
             </w:r>
-            <w:proofErr w:type="spellStart"/>
-            <w:proofErr w:type="gramStart"/>
             <w:r>
               <w:rPr>
                 <w:rFonts w:ascii="Calibri" w:hAnsi="Calibri" w:cs="Calibri"/>
@@ -6905,8 +6513,6 @@
               </w:rPr>
               <w:t>Pedina</w:t>
             </w:r>
-            <w:proofErr w:type="spellEnd"/>
-            <w:proofErr w:type="gramEnd"/>
             <w:r>
               <w:rPr>
                 <w:rFonts w:ascii="Calibri" w:hAnsi="Calibri" w:cs="Calibri"/>
@@ -6940,8 +6546,6 @@
               </w:rPr>
               <w:t xml:space="preserve">- Gli attributi di </w:t>
             </w:r>
-            <w:proofErr w:type="spellStart"/>
-            <w:proofErr w:type="gramStart"/>
             <w:r>
               <w:rPr>
                 <w:rFonts w:ascii="Calibri" w:hAnsi="Calibri" w:cs="Calibri"/>
@@ -6956,8 +6560,6 @@
               </w:rPr>
               <w:t>Pedina</w:t>
             </w:r>
-            <w:proofErr w:type="spellEnd"/>
-            <w:proofErr w:type="gramEnd"/>
             <w:r>
               <w:rPr>
                 <w:rFonts w:ascii="Calibri" w:hAnsi="Calibri" w:cs="Calibri"/>
@@ -7055,7 +6657,6 @@
                 <w:iCs/>
               </w:rPr>
             </w:pPr>
-            <w:proofErr w:type="spellStart"/>
             <w:r>
               <w:rPr>
                 <w:rFonts w:ascii="Calibri" w:eastAsia="Aptos" w:hAnsi="Calibri" w:cs="Calibri"/>
@@ -7069,7 +6670,6 @@
               </w:rPr>
               <w:t>avviaPartitaSP</w:t>
             </w:r>
-            <w:proofErr w:type="spellEnd"/>
           </w:p>
         </w:tc>
       </w:tr>
@@ -7111,33 +6711,11 @@
                 <w:rFonts w:ascii="Calibri" w:eastAsia="Aptos" w:hAnsi="Calibri" w:cs="Calibri"/>
               </w:rPr>
             </w:pPr>
-            <w:proofErr w:type="spellStart"/>
-            <w:r>
-              <w:rPr>
-                <w:rFonts w:ascii="Calibri" w:eastAsia="Aptos" w:hAnsi="Calibri" w:cs="Calibri"/>
-              </w:rPr>
-              <w:t>avviaPartitaSP</w:t>
-            </w:r>
-            <w:proofErr w:type="spellEnd"/>
-            <w:r>
-              <w:rPr>
-                <w:rFonts w:ascii="Calibri" w:eastAsia="Aptos" w:hAnsi="Calibri" w:cs="Calibri"/>
-              </w:rPr>
-              <w:t>(</w:t>
-            </w:r>
-            <w:proofErr w:type="spellStart"/>
-            <w:r>
-              <w:rPr>
-                <w:rFonts w:ascii="Calibri" w:eastAsia="Aptos" w:hAnsi="Calibri" w:cs="Calibri"/>
-              </w:rPr>
-              <w:t>idPartita</w:t>
-            </w:r>
-            <w:proofErr w:type="spellEnd"/>
-            <w:r>
-              <w:rPr>
-                <w:rFonts w:ascii="Calibri" w:eastAsia="Aptos" w:hAnsi="Calibri" w:cs="Calibri"/>
-              </w:rPr>
-              <w:t>)</w:t>
+            <w:r>
+              <w:rPr>
+                <w:rFonts w:ascii="Calibri" w:eastAsia="Aptos" w:hAnsi="Calibri" w:cs="Calibri"/>
+              </w:rPr>
+              <w:t>avviaPartitaSP(idPartita)</w:t>
             </w:r>
           </w:p>
         </w:tc>
@@ -7183,21 +6761,7 @@
               <w:rPr>
                 <w:rFonts w:ascii="Calibri" w:hAnsi="Calibri" w:cs="Calibri"/>
               </w:rPr>
-              <w:t xml:space="preserve">Caso d’uso UC1: Configurazione e avvio partita </w:t>
-            </w:r>
-            <w:proofErr w:type="spellStart"/>
-            <w:r>
-              <w:rPr>
-                <w:rFonts w:ascii="Calibri" w:hAnsi="Calibri" w:cs="Calibri"/>
-              </w:rPr>
-              <w:t>singleplayer</w:t>
-            </w:r>
-            <w:proofErr w:type="spellEnd"/>
-            <w:r>
-              <w:rPr>
-                <w:rFonts w:ascii="Calibri" w:hAnsi="Calibri" w:cs="Calibri"/>
-              </w:rPr>
-              <w:t>;</w:t>
+              <w:t>Caso d’uso UC1: Configurazione e avvio partita singleplayer;</w:t>
             </w:r>
           </w:p>
         </w:tc>
@@ -7265,17 +6829,8 @@
                 <w:rFonts w:ascii="Calibri" w:hAnsi="Calibri" w:cs="Calibri"/>
                 <w:i/>
               </w:rPr>
-              <w:t xml:space="preserve"> </w:t>
-            </w:r>
-            <w:proofErr w:type="spellStart"/>
-            <w:r>
-              <w:rPr>
-                <w:rFonts w:ascii="Calibri" w:hAnsi="Calibri" w:cs="Calibri"/>
-                <w:i/>
-              </w:rPr>
-              <w:t>GiocoDell’Oca</w:t>
-            </w:r>
-            <w:proofErr w:type="spellEnd"/>
+              <w:t xml:space="preserve"> GiocoDell’Oca</w:t>
+            </w:r>
             <w:r>
               <w:rPr>
                 <w:rFonts w:ascii="Calibri" w:hAnsi="Calibri" w:cs="Calibri"/>
@@ -7377,8 +6932,6 @@
               </w:rPr>
               <w:t xml:space="preserve">- È stata creata una nuova istanza </w:t>
             </w:r>
-            <w:proofErr w:type="spellStart"/>
-            <w:proofErr w:type="gramStart"/>
             <w:r>
               <w:rPr>
                 <w:rFonts w:ascii="Calibri" w:hAnsi="Calibri" w:cs="Calibri"/>
@@ -7386,8 +6939,6 @@
               </w:rPr>
               <w:t>personalizzazioneDado</w:t>
             </w:r>
-            <w:proofErr w:type="spellEnd"/>
-            <w:proofErr w:type="gramEnd"/>
             <w:r>
               <w:rPr>
                 <w:rFonts w:ascii="Calibri" w:hAnsi="Calibri" w:cs="Calibri"/>
@@ -7422,8 +6973,6 @@
               </w:rPr>
               <w:t xml:space="preserve">- È stata creata una nuova istanza </w:t>
             </w:r>
-            <w:proofErr w:type="spellStart"/>
-            <w:proofErr w:type="gramStart"/>
             <w:r>
               <w:rPr>
                 <w:rFonts w:ascii="Calibri" w:hAnsi="Calibri" w:cs="Calibri"/>
@@ -7431,8 +6980,6 @@
               </w:rPr>
               <w:t>personalizzazionePedina</w:t>
             </w:r>
-            <w:proofErr w:type="spellEnd"/>
-            <w:proofErr w:type="gramEnd"/>
             <w:r>
               <w:rPr>
                 <w:rFonts w:ascii="Calibri" w:hAnsi="Calibri" w:cs="Calibri"/>
@@ -7717,13 +7264,8 @@
     </w:p>
     <w:p>
       <w:r>
-        <w:t xml:space="preserve">SD - </w:t>
-      </w:r>
-      <w:proofErr w:type="spellStart"/>
-      <w:r>
-        <w:t>configuraNuovaPartitaSP</w:t>
-      </w:r>
-      <w:proofErr w:type="spellEnd"/>
+        <w:t>SD - configuraNuovaPartitaSP</w:t>
+      </w:r>
     </w:p>
     <w:p>
       <w:pPr>
@@ -7745,7 +7287,7 @@
           <w:shd w:val="clear" w:color="auto" w:fill="FFFFFF"/>
         </w:rPr>
         <w:drawing>
-          <wp:inline distT="0" distB="0" distL="0" distR="0" wp14:anchorId="69CEFF47" wp14:editId="61892680">
+          <wp:inline distT="0" distB="0" distL="0" distR="0" wp14:anchorId="69CEFF47" wp14:editId="7BCC1E1B">
             <wp:extent cx="6120130" cy="2586990"/>
             <wp:effectExtent l="0" t="0" r="0" b="3810"/>
             <wp:docPr id="1563156612" name="Immagine 5" descr="Immagine che contiene testo, diagramma, schermata, linea"/>
@@ -7801,20 +7343,8 @@
           <w:szCs w:val="24"/>
           <w:shd w:val="clear" w:color="auto" w:fill="FFFFFF"/>
         </w:rPr>
-        <w:t xml:space="preserve">SD </w:t>
-      </w:r>
-      <w:proofErr w:type="spellStart"/>
-      <w:r>
-        <w:rPr>
-          <w:rFonts w:ascii="Calibri" w:hAnsi="Calibri" w:cs="Calibri"/>
-          <w:color w:val="0D0D0D"/>
-          <w:sz w:val="24"/>
-          <w:szCs w:val="24"/>
-          <w:shd w:val="clear" w:color="auto" w:fill="FFFFFF"/>
-        </w:rPr>
-        <w:t>setRegolaSingola</w:t>
-      </w:r>
-      <w:proofErr w:type="spellEnd"/>
+        <w:t>SD setRegolaSingola</w:t>
+      </w:r>
     </w:p>
     <w:p>
       <w:pPr>
@@ -7836,7 +7366,7 @@
           <w:shd w:val="clear" w:color="auto" w:fill="FFFFFF"/>
         </w:rPr>
         <w:drawing>
-          <wp:inline distT="0" distB="0" distL="0" distR="0" wp14:anchorId="3A7F4745" wp14:editId="50EE503D">
+          <wp:inline distT="0" distB="0" distL="0" distR="0" wp14:anchorId="3A7F4745" wp14:editId="3784C6D1">
             <wp:extent cx="6120130" cy="2659380"/>
             <wp:effectExtent l="0" t="0" r="0" b="7620"/>
             <wp:docPr id="448771579" name="Immagine 6" descr="Immagine che contiene testo, diagramma, schermata, linea"/>
@@ -7897,20 +7427,8 @@
           <w:shd w:val="clear" w:color="auto" w:fill="FFFFFF"/>
         </w:rPr>
         <w:lastRenderedPageBreak/>
-        <w:t xml:space="preserve">SD </w:t>
-      </w:r>
-      <w:proofErr w:type="spellStart"/>
-      <w:r>
-        <w:rPr>
-          <w:rFonts w:ascii="Calibri" w:hAnsi="Calibri" w:cs="Calibri"/>
-          <w:color w:val="0D0D0D"/>
-          <w:sz w:val="24"/>
-          <w:szCs w:val="24"/>
-          <w:shd w:val="clear" w:color="auto" w:fill="FFFFFF"/>
-        </w:rPr>
-        <w:t>setRegolaSetPredefinito</w:t>
-      </w:r>
-      <w:proofErr w:type="spellEnd"/>
+        <w:t>SD setRegolaSetPredefinito</w:t>
+      </w:r>
     </w:p>
     <w:p>
       <w:pPr>
@@ -7992,20 +7510,8 @@
           <w:szCs w:val="24"/>
           <w:shd w:val="clear" w:color="auto" w:fill="FFFFFF"/>
         </w:rPr>
-        <w:t xml:space="preserve">SD </w:t>
-      </w:r>
-      <w:proofErr w:type="spellStart"/>
-      <w:r>
-        <w:rPr>
-          <w:rFonts w:ascii="Calibri" w:hAnsi="Calibri" w:cs="Calibri"/>
-          <w:color w:val="0D0D0D"/>
-          <w:sz w:val="24"/>
-          <w:szCs w:val="24"/>
-          <w:shd w:val="clear" w:color="auto" w:fill="FFFFFF"/>
-        </w:rPr>
-        <w:t>setScenario</w:t>
-      </w:r>
-      <w:proofErr w:type="spellEnd"/>
+        <w:t>SD setScenario</w:t>
+      </w:r>
     </w:p>
     <w:p>
       <w:pPr>
@@ -8027,7 +7533,7 @@
           <w:shd w:val="clear" w:color="auto" w:fill="FFFFFF"/>
         </w:rPr>
         <w:drawing>
-          <wp:inline distT="0" distB="0" distL="0" distR="0" wp14:anchorId="77160A6D" wp14:editId="3910B4A1">
+          <wp:inline distT="0" distB="0" distL="0" distR="0" wp14:anchorId="77160A6D" wp14:editId="0C6FC928">
             <wp:extent cx="6120130" cy="2486025"/>
             <wp:effectExtent l="0" t="0" r="0" b="9525"/>
             <wp:docPr id="547097666" name="Immagine 8" descr="Immagine che contiene testo, diagramma, linea, schermata"/>
@@ -8089,7 +7595,6 @@
         </w:rPr>
         <w:t xml:space="preserve">SD </w:t>
       </w:r>
-      <w:proofErr w:type="spellStart"/>
       <w:r>
         <w:rPr>
           <w:rFonts w:ascii="Calibri" w:hAnsi="Calibri" w:cs="Calibri"/>
@@ -8100,7 +7605,6 @@
         </w:rPr>
         <w:t>setDado</w:t>
       </w:r>
-      <w:proofErr w:type="spellEnd"/>
     </w:p>
     <w:p>
       <w:pPr>
@@ -8183,20 +7687,8 @@
           <w:shd w:val="clear" w:color="auto" w:fill="FFFFFF"/>
         </w:rPr>
         <w:lastRenderedPageBreak/>
-        <w:t xml:space="preserve">SD </w:t>
-      </w:r>
-      <w:proofErr w:type="spellStart"/>
-      <w:r>
-        <w:rPr>
-          <w:rFonts w:ascii="Calibri" w:hAnsi="Calibri" w:cs="Calibri"/>
-          <w:color w:val="0D0D0D"/>
-          <w:sz w:val="24"/>
-          <w:szCs w:val="24"/>
-          <w:shd w:val="clear" w:color="auto" w:fill="FFFFFF"/>
-        </w:rPr>
-        <w:t>setPedina</w:t>
-      </w:r>
-      <w:proofErr w:type="spellEnd"/>
+        <w:t>SD setPedina</w:t>
+      </w:r>
       <w:r>
         <w:rPr>
           <w:rFonts w:ascii="Calibri" w:hAnsi="Calibri" w:cs="Calibri"/>
@@ -8267,20 +7759,8 @@
           <w:szCs w:val="24"/>
           <w:shd w:val="clear" w:color="auto" w:fill="FFFFFF"/>
         </w:rPr>
-        <w:t xml:space="preserve">SD </w:t>
-      </w:r>
-      <w:proofErr w:type="spellStart"/>
-      <w:r>
-        <w:rPr>
-          <w:rFonts w:ascii="Calibri" w:hAnsi="Calibri" w:cs="Calibri"/>
-          <w:color w:val="0D0D0D"/>
-          <w:sz w:val="24"/>
-          <w:szCs w:val="24"/>
-          <w:shd w:val="clear" w:color="auto" w:fill="FFFFFF"/>
-        </w:rPr>
-        <w:t>avviaPartitaSP</w:t>
-      </w:r>
-      <w:proofErr w:type="spellEnd"/>
+        <w:t>SD avviaPartitaSP</w:t>
+      </w:r>
     </w:p>
     <w:p>
       <w:pPr>
@@ -8515,7 +7995,7 @@
           <w:szCs w:val="24"/>
         </w:rPr>
         <w:drawing>
-          <wp:inline distT="0" distB="0" distL="0" distR="0" wp14:anchorId="6059BA67" wp14:editId="7D296B92">
+          <wp:inline distT="0" distB="0" distL="0" distR="0" wp14:anchorId="6059BA67" wp14:editId="2604424A">
             <wp:extent cx="6120130" cy="3122295"/>
             <wp:effectExtent l="0" t="0" r="0" b="1905"/>
             <wp:docPr id="1931516535" name="Immagine 13" descr="Immagine che contiene testo, diagramma, linea, Parallelo"/>
@@ -8733,6 +8213,322 @@
           <w:szCs w:val="22"/>
         </w:rPr>
         <w:t>: Per questa prima iterazione, non sono stati implementati controlli per la validazione degli input.</w:t>
+      </w:r>
+    </w:p>
+    <w:p>
+      <w:pPr>
+        <w:pStyle w:val="NormaleWeb"/>
+        <w:rPr>
+          <w:rFonts w:ascii="Calibri" w:hAnsi="Calibri" w:cs="Calibri"/>
+          <w:sz w:val="22"/>
+          <w:szCs w:val="22"/>
+        </w:rPr>
+      </w:pPr>
+    </w:p>
+    <w:p>
+      <w:pPr>
+        <w:pStyle w:val="Titolo1"/>
+        <w:jc w:val="center"/>
+        <w:rPr>
+          <w:rFonts w:ascii="Calibri" w:hAnsi="Calibri" w:cs="Calibri"/>
+        </w:rPr>
+      </w:pPr>
+      <w:r>
+        <w:rPr>
+          <w:rFonts w:ascii="Calibri" w:hAnsi="Calibri" w:cs="Calibri"/>
+        </w:rPr>
+        <w:t>6. Testing</w:t>
+      </w:r>
+    </w:p>
+    <w:p>
+      <w:pPr>
+        <w:pStyle w:val="NormaleWeb"/>
+      </w:pPr>
+      <w:r>
+        <w:t xml:space="preserve">I test sono stati eseguiti sulla classe </w:t>
+      </w:r>
+      <w:r>
+        <w:t>GiocoDellOca</w:t>
+      </w:r>
+      <w:r>
+        <w:t>.</w:t>
+      </w:r>
+    </w:p>
+    <w:p>
+      <w:pPr>
+        <w:pStyle w:val="NormaleWeb"/>
+        <w:numPr>
+          <w:ilvl w:val="0"/>
+          <w:numId w:val="5"/>
+        </w:numPr>
+      </w:pPr>
+      <w:r>
+        <w:t>configuraNuovaPartitaSP</w:t>
+      </w:r>
+    </w:p>
+    <w:p>
+      <w:pPr>
+        <w:pStyle w:val="NormaleWeb"/>
+        <w:numPr>
+          <w:ilvl w:val="1"/>
+          <w:numId w:val="5"/>
+        </w:numPr>
+      </w:pPr>
+      <w:r>
+        <w:t>la partita</w:t>
+      </w:r>
+      <w:r>
+        <w:t xml:space="preserve"> che si sta inserendo diventa corrente per </w:t>
+      </w:r>
+      <w:r>
+        <w:t>GiocoDellOca</w:t>
+      </w:r>
+      <w:r>
+        <w:t>.</w:t>
+      </w:r>
+    </w:p>
+    <w:p>
+      <w:pPr>
+        <w:pStyle w:val="NormaleWeb"/>
+        <w:numPr>
+          <w:ilvl w:val="0"/>
+          <w:numId w:val="5"/>
+        </w:numPr>
+      </w:pPr>
+      <w:r>
+        <w:t>setRegolaSingola</w:t>
+      </w:r>
+    </w:p>
+    <w:p>
+      <w:pPr>
+        <w:pStyle w:val="NormaleWeb"/>
+        <w:numPr>
+          <w:ilvl w:val="1"/>
+          <w:numId w:val="5"/>
+        </w:numPr>
+      </w:pPr>
+      <w:r>
+        <w:t xml:space="preserve">Si settano le </w:t>
+      </w:r>
+      <w:r>
+        <w:t>regole</w:t>
+      </w:r>
+      <w:r>
+        <w:t xml:space="preserve"> che saranno utilizzate dal</w:t>
+      </w:r>
+      <w:r>
+        <w:t>la partita corrente</w:t>
+      </w:r>
+      <w:r>
+        <w:t>.</w:t>
+      </w:r>
+    </w:p>
+    <w:p>
+      <w:pPr>
+        <w:pStyle w:val="NormaleWeb"/>
+        <w:numPr>
+          <w:ilvl w:val="0"/>
+          <w:numId w:val="5"/>
+        </w:numPr>
+      </w:pPr>
+      <w:r>
+        <w:t>setRegolaSet</w:t>
+      </w:r>
+    </w:p>
+    <w:p>
+      <w:pPr>
+        <w:pStyle w:val="NormaleWeb"/>
+        <w:numPr>
+          <w:ilvl w:val="1"/>
+          <w:numId w:val="5"/>
+        </w:numPr>
+      </w:pPr>
+      <w:r>
+        <w:t>Si setta</w:t>
+      </w:r>
+      <w:r>
+        <w:t xml:space="preserve"> il set di</w:t>
+      </w:r>
+      <w:r>
+        <w:t xml:space="preserve"> regole che saranno utilizzate dalla partita corrente.</w:t>
+      </w:r>
+    </w:p>
+    <w:p>
+      <w:pPr>
+        <w:pStyle w:val="NormaleWeb"/>
+        <w:numPr>
+          <w:ilvl w:val="0"/>
+          <w:numId w:val="5"/>
+        </w:numPr>
+      </w:pPr>
+      <w:r>
+        <w:t>setScenario</w:t>
+      </w:r>
+    </w:p>
+    <w:p>
+      <w:pPr>
+        <w:pStyle w:val="NormaleWeb"/>
+        <w:numPr>
+          <w:ilvl w:val="1"/>
+          <w:numId w:val="5"/>
+        </w:numPr>
+      </w:pPr>
+      <w:r>
+        <w:t>Si setta</w:t>
+      </w:r>
+      <w:r>
+        <w:t xml:space="preserve"> </w:t>
+      </w:r>
+      <w:r>
+        <w:t>l</w:t>
+      </w:r>
+      <w:r>
+        <w:t>o</w:t>
+      </w:r>
+      <w:r>
+        <w:t xml:space="preserve"> </w:t>
+      </w:r>
+      <w:r>
+        <w:t>scenario</w:t>
+      </w:r>
+      <w:r>
+        <w:t xml:space="preserve"> che sar</w:t>
+      </w:r>
+      <w:r>
+        <w:t>à</w:t>
+      </w:r>
+      <w:r>
+        <w:t xml:space="preserve"> utilizzat</w:t>
+      </w:r>
+      <w:r>
+        <w:t>o</w:t>
+      </w:r>
+      <w:r>
+        <w:t xml:space="preserve"> dalla partita corrente.</w:t>
+      </w:r>
+    </w:p>
+    <w:p>
+      <w:pPr>
+        <w:pStyle w:val="NormaleWeb"/>
+        <w:numPr>
+          <w:ilvl w:val="0"/>
+          <w:numId w:val="5"/>
+        </w:numPr>
+      </w:pPr>
+      <w:r>
+        <w:t>setDado</w:t>
+      </w:r>
+    </w:p>
+    <w:p>
+      <w:pPr>
+        <w:pStyle w:val="NormaleWeb"/>
+        <w:numPr>
+          <w:ilvl w:val="1"/>
+          <w:numId w:val="5"/>
+        </w:numPr>
+      </w:pPr>
+      <w:r>
+        <w:t xml:space="preserve">Si </w:t>
+      </w:r>
+      <w:r>
+        <w:t>imposta</w:t>
+      </w:r>
+      <w:r>
+        <w:t xml:space="preserve"> </w:t>
+      </w:r>
+      <w:r>
+        <w:t>il dado</w:t>
+      </w:r>
+      <w:r>
+        <w:t xml:space="preserve"> che sar</w:t>
+      </w:r>
+      <w:r>
+        <w:t>à</w:t>
+      </w:r>
+      <w:r>
+        <w:t xml:space="preserve"> utilizzat</w:t>
+      </w:r>
+      <w:r>
+        <w:t>o</w:t>
+      </w:r>
+      <w:r>
+        <w:t xml:space="preserve"> dalla partita corrente.</w:t>
+      </w:r>
+    </w:p>
+    <w:p>
+      <w:pPr>
+        <w:pStyle w:val="NormaleWeb"/>
+        <w:numPr>
+          <w:ilvl w:val="0"/>
+          <w:numId w:val="5"/>
+        </w:numPr>
+      </w:pPr>
+      <w:r>
+        <w:t>setPedina</w:t>
+      </w:r>
+    </w:p>
+    <w:p>
+      <w:pPr>
+        <w:pStyle w:val="NormaleWeb"/>
+        <w:numPr>
+          <w:ilvl w:val="1"/>
+          <w:numId w:val="5"/>
+        </w:numPr>
+      </w:pPr>
+      <w:r>
+        <w:t>Si setta</w:t>
+      </w:r>
+      <w:r>
+        <w:t xml:space="preserve"> la pedina</w:t>
+      </w:r>
+      <w:r>
+        <w:t xml:space="preserve"> che sar</w:t>
+      </w:r>
+      <w:r>
+        <w:t>à</w:t>
+      </w:r>
+      <w:r>
+        <w:t xml:space="preserve"> utilizzat</w:t>
+      </w:r>
+      <w:r>
+        <w:t>a</w:t>
+      </w:r>
+      <w:r>
+        <w:t xml:space="preserve"> dalla partita corrente.</w:t>
+      </w:r>
+    </w:p>
+    <w:p>
+      <w:pPr>
+        <w:pStyle w:val="NormaleWeb"/>
+        <w:numPr>
+          <w:ilvl w:val="0"/>
+          <w:numId w:val="5"/>
+        </w:numPr>
+        <w:rPr>
+          <w:rFonts w:ascii="Calibri" w:hAnsi="Calibri" w:cs="Calibri"/>
+          <w:sz w:val="22"/>
+          <w:szCs w:val="22"/>
+        </w:rPr>
+      </w:pPr>
+      <w:r>
+        <w:t>avviaPartita</w:t>
+      </w:r>
+    </w:p>
+    <w:p>
+      <w:pPr>
+        <w:pStyle w:val="NormaleWeb"/>
+        <w:numPr>
+          <w:ilvl w:val="1"/>
+          <w:numId w:val="5"/>
+        </w:numPr>
+        <w:rPr>
+          <w:rFonts w:ascii="Calibri" w:hAnsi="Calibri" w:cs="Calibri"/>
+          <w:sz w:val="22"/>
+          <w:szCs w:val="22"/>
+        </w:rPr>
+      </w:pPr>
+      <w:r>
+        <w:t>Si accerta che la partita sia attivata correttamente</w:t>
       </w:r>
     </w:p>
     <w:p>
@@ -9237,6 +9033,119 @@
     </w:lvl>
   </w:abstractNum>
   <w:abstractNum w:abstractNumId="2" w15:restartNumberingAfterBreak="0">
+    <w:nsid w:val="13BE21D3"/>
+    <w:multiLevelType w:val="hybridMultilevel"/>
+    <w:tmpl w:val="CBB8FA72"/>
+    <w:lvl w:ilvl="0" w:tplc="04100001">
+      <w:start w:val="1"/>
+      <w:numFmt w:val="bullet"/>
+      <w:lvlText w:val=""/>
+      <w:lvlJc w:val="left"/>
+      <w:pPr>
+        <w:ind w:left="720" w:hanging="360"/>
+      </w:pPr>
+      <w:rPr>
+        <w:rFonts w:ascii="Symbol" w:hAnsi="Symbol" w:hint="default"/>
+      </w:rPr>
+    </w:lvl>
+    <w:lvl w:ilvl="1" w:tplc="04100003">
+      <w:start w:val="1"/>
+      <w:numFmt w:val="bullet"/>
+      <w:lvlText w:val="o"/>
+      <w:lvlJc w:val="left"/>
+      <w:pPr>
+        <w:ind w:left="1440" w:hanging="360"/>
+      </w:pPr>
+      <w:rPr>
+        <w:rFonts w:ascii="Courier New" w:hAnsi="Courier New" w:cs="Courier New" w:hint="default"/>
+      </w:rPr>
+    </w:lvl>
+    <w:lvl w:ilvl="2" w:tplc="04100005" w:tentative="1">
+      <w:start w:val="1"/>
+      <w:numFmt w:val="bullet"/>
+      <w:lvlText w:val=""/>
+      <w:lvlJc w:val="left"/>
+      <w:pPr>
+        <w:ind w:left="2160" w:hanging="360"/>
+      </w:pPr>
+      <w:rPr>
+        <w:rFonts w:ascii="Wingdings" w:hAnsi="Wingdings" w:hint="default"/>
+      </w:rPr>
+    </w:lvl>
+    <w:lvl w:ilvl="3" w:tplc="04100001" w:tentative="1">
+      <w:start w:val="1"/>
+      <w:numFmt w:val="bullet"/>
+      <w:lvlText w:val=""/>
+      <w:lvlJc w:val="left"/>
+      <w:pPr>
+        <w:ind w:left="2880" w:hanging="360"/>
+      </w:pPr>
+      <w:rPr>
+        <w:rFonts w:ascii="Symbol" w:hAnsi="Symbol" w:hint="default"/>
+      </w:rPr>
+    </w:lvl>
+    <w:lvl w:ilvl="4" w:tplc="04100003" w:tentative="1">
+      <w:start w:val="1"/>
+      <w:numFmt w:val="bullet"/>
+      <w:lvlText w:val="o"/>
+      <w:lvlJc w:val="left"/>
+      <w:pPr>
+        <w:ind w:left="3600" w:hanging="360"/>
+      </w:pPr>
+      <w:rPr>
+        <w:rFonts w:ascii="Courier New" w:hAnsi="Courier New" w:cs="Courier New" w:hint="default"/>
+      </w:rPr>
+    </w:lvl>
+    <w:lvl w:ilvl="5" w:tplc="04100005" w:tentative="1">
+      <w:start w:val="1"/>
+      <w:numFmt w:val="bullet"/>
+      <w:lvlText w:val=""/>
+      <w:lvlJc w:val="left"/>
+      <w:pPr>
+        <w:ind w:left="4320" w:hanging="360"/>
+      </w:pPr>
+      <w:rPr>
+        <w:rFonts w:ascii="Wingdings" w:hAnsi="Wingdings" w:hint="default"/>
+      </w:rPr>
+    </w:lvl>
+    <w:lvl w:ilvl="6" w:tplc="04100001" w:tentative="1">
+      <w:start w:val="1"/>
+      <w:numFmt w:val="bullet"/>
+      <w:lvlText w:val=""/>
+      <w:lvlJc w:val="left"/>
+      <w:pPr>
+        <w:ind w:left="5040" w:hanging="360"/>
+      </w:pPr>
+      <w:rPr>
+        <w:rFonts w:ascii="Symbol" w:hAnsi="Symbol" w:hint="default"/>
+      </w:rPr>
+    </w:lvl>
+    <w:lvl w:ilvl="7" w:tplc="04100003" w:tentative="1">
+      <w:start w:val="1"/>
+      <w:numFmt w:val="bullet"/>
+      <w:lvlText w:val="o"/>
+      <w:lvlJc w:val="left"/>
+      <w:pPr>
+        <w:ind w:left="5760" w:hanging="360"/>
+      </w:pPr>
+      <w:rPr>
+        <w:rFonts w:ascii="Courier New" w:hAnsi="Courier New" w:cs="Courier New" w:hint="default"/>
+      </w:rPr>
+    </w:lvl>
+    <w:lvl w:ilvl="8" w:tplc="04100005" w:tentative="1">
+      <w:start w:val="1"/>
+      <w:numFmt w:val="bullet"/>
+      <w:lvlText w:val=""/>
+      <w:lvlJc w:val="left"/>
+      <w:pPr>
+        <w:ind w:left="6480" w:hanging="360"/>
+      </w:pPr>
+      <w:rPr>
+        <w:rFonts w:ascii="Wingdings" w:hAnsi="Wingdings" w:hint="default"/>
+      </w:rPr>
+    </w:lvl>
+  </w:abstractNum>
+  <w:abstractNum w:abstractNumId="3" w15:restartNumberingAfterBreak="0">
     <w:nsid w:val="16B01F32"/>
     <w:multiLevelType w:val="multilevel"/>
     <w:tmpl w:val="F4EE0E02"/>
@@ -9314,7 +9223,7 @@
       </w:pPr>
     </w:lvl>
   </w:abstractNum>
-  <w:abstractNum w:abstractNumId="3" w15:restartNumberingAfterBreak="0">
+  <w:abstractNum w:abstractNumId="4" w15:restartNumberingAfterBreak="0">
     <w:nsid w:val="70746A20"/>
     <w:multiLevelType w:val="multilevel"/>
     <w:tmpl w:val="28CA4454"/>
@@ -9467,13 +9376,16 @@
     <w:abstractNumId w:val="0"/>
   </w:num>
   <w:num w:numId="2" w16cid:durableId="1453553918">
-    <w:abstractNumId w:val="2"/>
+    <w:abstractNumId w:val="3"/>
   </w:num>
   <w:num w:numId="3" w16cid:durableId="1847984744">
     <w:abstractNumId w:val="1"/>
   </w:num>
   <w:num w:numId="4" w16cid:durableId="1281305233">
-    <w:abstractNumId w:val="3"/>
+    <w:abstractNumId w:val="4"/>
+  </w:num>
+  <w:num w:numId="5" w16cid:durableId="169488694">
+    <w:abstractNumId w:val="2"/>
   </w:num>
 </w:numbering>
 </file>
@@ -11626,7 +11538,9 @@
     <w:rsid w:val="0021510A"/>
     <w:rsid w:val="003433F2"/>
     <w:rsid w:val="00355375"/>
+    <w:rsid w:val="004218F1"/>
     <w:rsid w:val="0044136E"/>
+    <w:rsid w:val="00451481"/>
     <w:rsid w:val="005E049C"/>
     <w:rsid w:val="006058B6"/>
     <w:rsid w:val="00696856"/>

</xml_diff>

<commit_message>
update documentazione iterazione 2
</commit_message>
<xml_diff>
--- a/Documentazione/Elaborazione/Iterazione 1/Iterazione 1.docx
+++ b/Documentazione/Elaborazione/Iterazione 1/Iterazione 1.docx
@@ -580,7 +580,7 @@
             </w:rPr>
             <w:fldChar w:fldCharType="separate"/>
           </w:r>
-          <w:hyperlink w:anchor="_Toc171097030" w:history="1">
+          <w:hyperlink w:anchor="_Toc172061552" w:history="1">
             <w:r>
               <w:rPr>
                 <w:rStyle w:val="Collegamentoipertestuale"/>
@@ -627,7 +627,7 @@
                 <w:noProof/>
                 <w:webHidden/>
               </w:rPr>
-              <w:instrText xml:space="preserve"> PAGEREF _Toc171097030 \h </w:instrText>
+              <w:instrText xml:space="preserve"> PAGEREF _Toc172061552 \h </w:instrText>
             </w:r>
             <w:r>
               <w:rPr>
@@ -673,7 +673,7 @@
               <w14:ligatures w14:val="standardContextual"/>
             </w:rPr>
           </w:pPr>
-          <w:hyperlink w:anchor="_Toc171097031" w:history="1">
+          <w:hyperlink w:anchor="_Toc172061553" w:history="1">
             <w:r>
               <w:rPr>
                 <w:rStyle w:val="Collegamentoipertestuale"/>
@@ -701,7 +701,7 @@
                 <w:noProof/>
                 <w:webHidden/>
               </w:rPr>
-              <w:instrText xml:space="preserve"> PAGEREF _Toc171097031 \h </w:instrText>
+              <w:instrText xml:space="preserve"> PAGEREF _Toc172061553 \h </w:instrText>
             </w:r>
             <w:r>
               <w:rPr>
@@ -747,7 +747,7 @@
               <w14:ligatures w14:val="standardContextual"/>
             </w:rPr>
           </w:pPr>
-          <w:hyperlink w:anchor="_Toc171097032" w:history="1">
+          <w:hyperlink w:anchor="_Toc172061554" w:history="1">
             <w:r>
               <w:rPr>
                 <w:rStyle w:val="Collegamentoipertestuale"/>
@@ -775,7 +775,7 @@
                 <w:noProof/>
                 <w:webHidden/>
               </w:rPr>
-              <w:instrText xml:space="preserve"> PAGEREF _Toc171097032 \h </w:instrText>
+              <w:instrText xml:space="preserve"> PAGEREF _Toc172061554 \h </w:instrText>
             </w:r>
             <w:r>
               <w:rPr>
@@ -821,7 +821,7 @@
               <w14:ligatures w14:val="standardContextual"/>
             </w:rPr>
           </w:pPr>
-          <w:hyperlink w:anchor="_Toc171097033" w:history="1">
+          <w:hyperlink w:anchor="_Toc172061555" w:history="1">
             <w:r>
               <w:rPr>
                 <w:rStyle w:val="Collegamentoipertestuale"/>
@@ -850,7 +850,7 @@
                 <w:noProof/>
                 <w:webHidden/>
               </w:rPr>
-              <w:instrText xml:space="preserve"> PAGEREF _Toc171097033 \h </w:instrText>
+              <w:instrText xml:space="preserve"> PAGEREF _Toc172061555 \h </w:instrText>
             </w:r>
             <w:r>
               <w:rPr>
@@ -896,7 +896,7 @@
               <w14:ligatures w14:val="standardContextual"/>
             </w:rPr>
           </w:pPr>
-          <w:hyperlink w:anchor="_Toc171097034" w:history="1">
+          <w:hyperlink w:anchor="_Toc172061556" w:history="1">
             <w:r>
               <w:rPr>
                 <w:rStyle w:val="Collegamentoipertestuale"/>
@@ -924,7 +924,7 @@
                 <w:noProof/>
                 <w:webHidden/>
               </w:rPr>
-              <w:instrText xml:space="preserve"> PAGEREF _Toc171097034 \h </w:instrText>
+              <w:instrText xml:space="preserve"> PAGEREF _Toc172061556 \h </w:instrText>
             </w:r>
             <w:r>
               <w:rPr>
@@ -970,7 +970,7 @@
               <w14:ligatures w14:val="standardContextual"/>
             </w:rPr>
           </w:pPr>
-          <w:hyperlink w:anchor="_Toc171097035" w:history="1">
+          <w:hyperlink w:anchor="_Toc172061557" w:history="1">
             <w:r>
               <w:rPr>
                 <w:rStyle w:val="Collegamentoipertestuale"/>
@@ -998,7 +998,7 @@
                 <w:noProof/>
                 <w:webHidden/>
               </w:rPr>
-              <w:instrText xml:space="preserve"> PAGEREF _Toc171097035 \h </w:instrText>
+              <w:instrText xml:space="preserve"> PAGEREF _Toc172061557 \h </w:instrText>
             </w:r>
             <w:r>
               <w:rPr>
@@ -1044,7 +1044,7 @@
               <w14:ligatures w14:val="standardContextual"/>
             </w:rPr>
           </w:pPr>
-          <w:hyperlink w:anchor="_Toc171097036" w:history="1">
+          <w:hyperlink w:anchor="_Toc172061558" w:history="1">
             <w:r>
               <w:rPr>
                 <w:rStyle w:val="Collegamentoipertestuale"/>
@@ -1072,7 +1072,7 @@
                 <w:noProof/>
                 <w:webHidden/>
               </w:rPr>
-              <w:instrText xml:space="preserve"> PAGEREF _Toc171097036 \h </w:instrText>
+              <w:instrText xml:space="preserve"> PAGEREF _Toc172061558 \h </w:instrText>
             </w:r>
             <w:r>
               <w:rPr>
@@ -1118,7 +1118,7 @@
               <w14:ligatures w14:val="standardContextual"/>
             </w:rPr>
           </w:pPr>
-          <w:hyperlink w:anchor="_Toc171097037" w:history="1">
+          <w:hyperlink w:anchor="_Toc172061559" w:history="1">
             <w:r>
               <w:rPr>
                 <w:rStyle w:val="Collegamentoipertestuale"/>
@@ -1146,7 +1146,7 @@
                 <w:noProof/>
                 <w:webHidden/>
               </w:rPr>
-              <w:instrText xml:space="preserve"> PAGEREF _Toc171097037 \h </w:instrText>
+              <w:instrText xml:space="preserve"> PAGEREF _Toc172061559 \h </w:instrText>
             </w:r>
             <w:r>
               <w:rPr>
@@ -1192,7 +1192,7 @@
               <w14:ligatures w14:val="standardContextual"/>
             </w:rPr>
           </w:pPr>
-          <w:hyperlink w:anchor="_Toc171097038" w:history="1">
+          <w:hyperlink w:anchor="_Toc172061560" w:history="1">
             <w:r>
               <w:rPr>
                 <w:rStyle w:val="Collegamentoipertestuale"/>
@@ -1221,7 +1221,7 @@
                 <w:noProof/>
                 <w:webHidden/>
               </w:rPr>
-              <w:instrText xml:space="preserve"> PAGEREF _Toc171097038 \h </w:instrText>
+              <w:instrText xml:space="preserve"> PAGEREF _Toc172061560 \h </w:instrText>
             </w:r>
             <w:r>
               <w:rPr>
@@ -1267,7 +1267,7 @@
               <w14:ligatures w14:val="standardContextual"/>
             </w:rPr>
           </w:pPr>
-          <w:hyperlink w:anchor="_Toc171097039" w:history="1">
+          <w:hyperlink w:anchor="_Toc172061561" w:history="1">
             <w:r>
               <w:rPr>
                 <w:rStyle w:val="Collegamentoipertestuale"/>
@@ -1296,7 +1296,7 @@
                 <w:noProof/>
                 <w:webHidden/>
               </w:rPr>
-              <w:instrText xml:space="preserve"> PAGEREF _Toc171097039 \h </w:instrText>
+              <w:instrText xml:space="preserve"> PAGEREF _Toc172061561 \h </w:instrText>
             </w:r>
             <w:r>
               <w:rPr>
@@ -1342,7 +1342,7 @@
               <w14:ligatures w14:val="standardContextual"/>
             </w:rPr>
           </w:pPr>
-          <w:hyperlink w:anchor="_Toc171097040" w:history="1">
+          <w:hyperlink w:anchor="_Toc172061562" w:history="1">
             <w:r>
               <w:rPr>
                 <w:rStyle w:val="Collegamentoipertestuale"/>
@@ -1370,7 +1370,81 @@
                 <w:noProof/>
                 <w:webHidden/>
               </w:rPr>
-              <w:instrText xml:space="preserve"> PAGEREF _Toc171097040 \h </w:instrText>
+              <w:instrText xml:space="preserve"> PAGEREF _Toc172061562 \h </w:instrText>
+            </w:r>
+            <w:r>
+              <w:rPr>
+                <w:noProof/>
+                <w:webHidden/>
+              </w:rPr>
+            </w:r>
+            <w:r>
+              <w:rPr>
+                <w:noProof/>
+                <w:webHidden/>
+              </w:rPr>
+              <w:fldChar w:fldCharType="separate"/>
+            </w:r>
+            <w:r>
+              <w:rPr>
+                <w:noProof/>
+                <w:webHidden/>
+              </w:rPr>
+              <w:t>13</w:t>
+            </w:r>
+            <w:r>
+              <w:rPr>
+                <w:noProof/>
+                <w:webHidden/>
+              </w:rPr>
+              <w:fldChar w:fldCharType="end"/>
+            </w:r>
+          </w:hyperlink>
+        </w:p>
+        <w:p>
+          <w:pPr>
+            <w:pStyle w:val="Sommario1"/>
+            <w:tabs>
+              <w:tab w:val="right" w:leader="dot" w:pos="9628"/>
+            </w:tabs>
+            <w:rPr>
+              <w:rFonts w:asciiTheme="minorHAnsi" w:eastAsiaTheme="minorEastAsia" w:hAnsiTheme="minorHAnsi" w:cstheme="minorBidi"/>
+              <w:noProof/>
+              <w:kern w:val="2"/>
+              <w:sz w:val="24"/>
+              <w:szCs w:val="24"/>
+              <w14:ligatures w14:val="standardContextual"/>
+            </w:rPr>
+          </w:pPr>
+          <w:hyperlink w:anchor="_Toc172061563" w:history="1">
+            <w:r>
+              <w:rPr>
+                <w:rStyle w:val="Collegamentoipertestuale"/>
+                <w:rFonts w:ascii="Calibri" w:hAnsi="Calibri" w:cs="Calibri"/>
+                <w:noProof/>
+              </w:rPr>
+              <w:t>6. Testing</w:t>
+            </w:r>
+            <w:r>
+              <w:rPr>
+                <w:noProof/>
+                <w:webHidden/>
+              </w:rPr>
+              <w:tab/>
+            </w:r>
+            <w:r>
+              <w:rPr>
+                <w:noProof/>
+                <w:webHidden/>
+              </w:rPr>
+              <w:fldChar w:fldCharType="begin"/>
+            </w:r>
+            <w:r>
+              <w:rPr>
+                <w:noProof/>
+                <w:webHidden/>
+              </w:rPr>
+              <w:instrText xml:space="preserve"> PAGEREF _Toc172061563 \h </w:instrText>
             </w:r>
             <w:r>
               <w:rPr>
@@ -1437,7 +1511,7 @@
           <w:rFonts w:ascii="Calibri" w:hAnsi="Calibri" w:cs="Calibri"/>
         </w:rPr>
       </w:pPr>
-      <w:bookmarkStart w:id="0" w:name="_Toc171097030"/>
+      <w:bookmarkStart w:id="0" w:name="_Toc172061552"/>
       <w:r>
         <w:rPr>
           <w:rFonts w:ascii="Calibri" w:hAnsi="Calibri" w:cs="Calibri"/>
@@ -1658,7 +1732,7 @@
           <w:rFonts w:ascii="Calibri" w:hAnsi="Calibri" w:cs="Calibri"/>
         </w:rPr>
       </w:pPr>
-      <w:bookmarkStart w:id="1" w:name="_Toc171097031"/>
+      <w:bookmarkStart w:id="1" w:name="_Toc172061553"/>
       <w:r>
         <w:rPr>
           <w:rFonts w:ascii="Calibri" w:hAnsi="Calibri" w:cs="Calibri"/>
@@ -1686,6 +1760,7 @@
           <w:rFonts w:ascii="Calibri" w:hAnsi="Calibri" w:cs="Calibri"/>
           <w:highlight w:val="white"/>
         </w:rPr>
+        <w:lastRenderedPageBreak/>
         <w:t xml:space="preserve">Di seguito viene riportato nel dettaglio il caso d’uso UC1: </w:t>
       </w:r>
       <w:r>
@@ -1701,15 +1776,7 @@
           <w:rFonts w:ascii="Calibri" w:hAnsi="Calibri" w:cs="Calibri"/>
           <w:highlight w:val="white"/>
         </w:rPr>
-        <w:t xml:space="preserve">. Questo caso d’uso permette al giocatore di configurare una partita singleplayer al Gioco dell’Oca, </w:t>
-      </w:r>
-      <w:r>
-        <w:rPr>
-          <w:rFonts w:ascii="Calibri" w:hAnsi="Calibri" w:cs="Calibri"/>
-          <w:highlight w:val="white"/>
-        </w:rPr>
-        <w:lastRenderedPageBreak/>
-        <w:t>scegliendo le regole, lo scenario e le personalizzazioni da utilizzare per quella sessione di gioco, e avviare la stessa. Questo caso d’uso non presenta modifiche rispetto al caso d’uso presentato in fase di ideazione.</w:t>
+        <w:t>. Questo caso d’uso permette al giocatore di configurare una partita singleplayer al Gioco dell’Oca, scegliendo le regole, lo scenario e le personalizzazioni da utilizzare per quella sessione di gioco, e avviare la stessa. Questo caso d’uso non presenta modifiche rispetto al caso d’uso presentato in fase di ideazione.</w:t>
       </w:r>
       <w:bookmarkStart w:id="2" w:name="_heading=h.gjdgxs" w:colFirst="0" w:colLast="0"/>
       <w:bookmarkEnd w:id="2"/>
@@ -3046,7 +3113,7 @@
           <w:rFonts w:ascii="Calibri" w:hAnsi="Calibri" w:cs="Calibri"/>
         </w:rPr>
       </w:pPr>
-      <w:bookmarkStart w:id="3" w:name="_Toc171097032"/>
+      <w:bookmarkStart w:id="3" w:name="_Toc172061554"/>
       <w:r>
         <w:rPr>
           <w:rFonts w:ascii="Calibri" w:hAnsi="Calibri" w:cs="Calibri"/>
@@ -3168,7 +3235,7 @@
           <w:highlight w:val="white"/>
         </w:rPr>
       </w:pPr>
-      <w:bookmarkStart w:id="4" w:name="_Toc171097033"/>
+      <w:bookmarkStart w:id="4" w:name="_Toc172061555"/>
       <w:r>
         <w:rPr>
           <w:rFonts w:ascii="Calibri" w:hAnsi="Calibri" w:cs="Calibri"/>
@@ -3526,7 +3593,7 @@
           <w:szCs w:val="28"/>
         </w:rPr>
         <w:drawing>
-          <wp:inline distT="0" distB="0" distL="0" distR="0" wp14:anchorId="4989D762" wp14:editId="60ABFE5F">
+          <wp:inline distT="0" distB="0" distL="0" distR="0" wp14:anchorId="4989D762" wp14:editId="74D93210">
             <wp:extent cx="6120130" cy="3266440"/>
             <wp:effectExtent l="0" t="0" r="0" b="0"/>
             <wp:docPr id="118063030" name="Immagine 2" descr="Immagine che contiene testo, schermata, diagramma, linea"/>
@@ -3588,7 +3655,7 @@
           <w:szCs w:val="40"/>
         </w:rPr>
       </w:pPr>
-      <w:bookmarkStart w:id="5" w:name="_Toc171097034"/>
+      <w:bookmarkStart w:id="5" w:name="_Toc172061556"/>
       <w:r>
         <w:rPr>
           <w:rFonts w:ascii="Calibri" w:hAnsi="Calibri" w:cs="Calibri"/>
@@ -3721,7 +3788,7 @@
           <w:rFonts w:ascii="Calibri" w:hAnsi="Calibri" w:cs="Calibri"/>
         </w:rPr>
       </w:pPr>
-      <w:bookmarkStart w:id="6" w:name="_Toc171097035"/>
+      <w:bookmarkStart w:id="6" w:name="_Toc172061557"/>
       <w:r>
         <w:rPr>
           <w:rFonts w:ascii="Calibri" w:hAnsi="Calibri" w:cs="Calibri"/>
@@ -7114,7 +7181,7 @@
           <w:rFonts w:ascii="Calibri" w:hAnsi="Calibri" w:cs="Calibri"/>
         </w:rPr>
       </w:pPr>
-      <w:bookmarkStart w:id="7" w:name="_Toc171097036"/>
+      <w:bookmarkStart w:id="7" w:name="_Toc172061558"/>
       <w:r>
         <w:rPr>
           <w:rFonts w:ascii="Calibri" w:hAnsi="Calibri" w:cs="Calibri"/>
@@ -7253,7 +7320,7 @@
           <w:shd w:val="clear" w:color="auto" w:fill="FFFFFF"/>
         </w:rPr>
       </w:pPr>
-      <w:bookmarkStart w:id="8" w:name="_Toc171097037"/>
+      <w:bookmarkStart w:id="8" w:name="_Toc172061559"/>
       <w:r>
         <w:rPr>
           <w:shd w:val="clear" w:color="auto" w:fill="FFFFFF"/>
@@ -7287,7 +7354,7 @@
           <w:shd w:val="clear" w:color="auto" w:fill="FFFFFF"/>
         </w:rPr>
         <w:drawing>
-          <wp:inline distT="0" distB="0" distL="0" distR="0" wp14:anchorId="69CEFF47" wp14:editId="7BCC1E1B">
+          <wp:inline distT="0" distB="0" distL="0" distR="0" wp14:anchorId="69CEFF47" wp14:editId="591E275E">
             <wp:extent cx="6120130" cy="2586990"/>
             <wp:effectExtent l="0" t="0" r="0" b="3810"/>
             <wp:docPr id="1563156612" name="Immagine 5" descr="Immagine che contiene testo, diagramma, schermata, linea"/>
@@ -7366,7 +7433,7 @@
           <w:shd w:val="clear" w:color="auto" w:fill="FFFFFF"/>
         </w:rPr>
         <w:drawing>
-          <wp:inline distT="0" distB="0" distL="0" distR="0" wp14:anchorId="3A7F4745" wp14:editId="3784C6D1">
+          <wp:inline distT="0" distB="0" distL="0" distR="0" wp14:anchorId="3A7F4745" wp14:editId="0675327A">
             <wp:extent cx="6120130" cy="2659380"/>
             <wp:effectExtent l="0" t="0" r="0" b="7620"/>
             <wp:docPr id="448771579" name="Immagine 6" descr="Immagine che contiene testo, diagramma, schermata, linea"/>
@@ -7533,7 +7600,7 @@
           <w:shd w:val="clear" w:color="auto" w:fill="FFFFFF"/>
         </w:rPr>
         <w:drawing>
-          <wp:inline distT="0" distB="0" distL="0" distR="0" wp14:anchorId="77160A6D" wp14:editId="0C6FC928">
+          <wp:inline distT="0" distB="0" distL="0" distR="0" wp14:anchorId="77160A6D" wp14:editId="270F0666">
             <wp:extent cx="6120130" cy="2486025"/>
             <wp:effectExtent l="0" t="0" r="0" b="9525"/>
             <wp:docPr id="547097666" name="Immagine 8" descr="Immagine che contiene testo, diagramma, linea, schermata"/>
@@ -7832,7 +7899,7 @@
           <w:highlight w:val="white"/>
         </w:rPr>
       </w:pPr>
-      <w:bookmarkStart w:id="9" w:name="_Toc171097038"/>
+      <w:bookmarkStart w:id="9" w:name="_Toc172061560"/>
       <w:r>
         <w:rPr>
           <w:rFonts w:ascii="Calibri" w:hAnsi="Calibri" w:cs="Calibri"/>
@@ -7941,7 +8008,7 @@
           <w:highlight w:val="white"/>
         </w:rPr>
       </w:pPr>
-      <w:bookmarkStart w:id="10" w:name="_Toc171097039"/>
+      <w:bookmarkStart w:id="10" w:name="_Toc172061561"/>
       <w:r>
         <w:rPr>
           <w:rFonts w:ascii="Calibri" w:hAnsi="Calibri" w:cs="Calibri"/>
@@ -7995,7 +8062,7 @@
           <w:szCs w:val="24"/>
         </w:rPr>
         <w:drawing>
-          <wp:inline distT="0" distB="0" distL="0" distR="0" wp14:anchorId="6059BA67" wp14:editId="2604424A">
+          <wp:inline distT="0" distB="0" distL="0" distR="0" wp14:anchorId="6059BA67" wp14:editId="1992929B">
             <wp:extent cx="6120130" cy="3122295"/>
             <wp:effectExtent l="0" t="0" r="0" b="1905"/>
             <wp:docPr id="1931516535" name="Immagine 13" descr="Immagine che contiene testo, diagramma, linea, Parallelo"/>
@@ -8082,7 +8149,7 @@
           <w:u w:val="single"/>
         </w:rPr>
       </w:pPr>
-      <w:bookmarkStart w:id="11" w:name="_Toc171097040"/>
+      <w:bookmarkStart w:id="11" w:name="_Toc172061562"/>
       <w:r>
         <w:rPr>
           <w:rFonts w:ascii="Calibri" w:hAnsi="Calibri" w:cs="Calibri"/>
@@ -8233,25 +8300,21 @@
           <w:rFonts w:ascii="Calibri" w:hAnsi="Calibri" w:cs="Calibri"/>
         </w:rPr>
       </w:pPr>
+      <w:bookmarkStart w:id="12" w:name="_Toc172061563"/>
       <w:r>
         <w:rPr>
           <w:rFonts w:ascii="Calibri" w:hAnsi="Calibri" w:cs="Calibri"/>
         </w:rPr>
         <w:t>6. Testing</w:t>
       </w:r>
+      <w:bookmarkEnd w:id="12"/>
     </w:p>
     <w:p>
       <w:pPr>
         <w:pStyle w:val="NormaleWeb"/>
       </w:pPr>
       <w:r>
-        <w:t xml:space="preserve">I test sono stati eseguiti sulla classe </w:t>
-      </w:r>
-      <w:r>
-        <w:t>GiocoDellOca</w:t>
-      </w:r>
-      <w:r>
-        <w:t>.</w:t>
+        <w:t>I test sono stati eseguiti sulla classe GiocoDellOca.</w:t>
       </w:r>
     </w:p>
     <w:p>
@@ -8275,16 +8338,7 @@
         </w:numPr>
       </w:pPr>
       <w:r>
-        <w:t>la partita</w:t>
-      </w:r>
-      <w:r>
-        <w:t xml:space="preserve"> che si sta inserendo diventa corrente per </w:t>
-      </w:r>
-      <w:r>
-        <w:t>GiocoDellOca</w:t>
-      </w:r>
-      <w:r>
-        <w:t>.</w:t>
+        <w:t>la partita che si sta inserendo diventa corrente per GiocoDellOca.</w:t>
       </w:r>
     </w:p>
     <w:p>
@@ -8308,19 +8362,7 @@
         </w:numPr>
       </w:pPr>
       <w:r>
-        <w:t xml:space="preserve">Si settano le </w:t>
-      </w:r>
-      <w:r>
-        <w:t>regole</w:t>
-      </w:r>
-      <w:r>
-        <w:t xml:space="preserve"> che saranno utilizzate dal</w:t>
-      </w:r>
-      <w:r>
-        <w:t>la partita corrente</w:t>
-      </w:r>
-      <w:r>
-        <w:t>.</w:t>
+        <w:t>Si settano le regole che saranno utilizzate dalla partita corrente.</w:t>
       </w:r>
     </w:p>
     <w:p>
@@ -8344,13 +8386,7 @@
         </w:numPr>
       </w:pPr>
       <w:r>
-        <w:t>Si setta</w:t>
-      </w:r>
-      <w:r>
-        <w:t xml:space="preserve"> il set di</w:t>
-      </w:r>
-      <w:r>
-        <w:t xml:space="preserve"> regole che saranno utilizzate dalla partita corrente.</w:t>
+        <w:t>Si setta il set di regole che saranno utilizzate dalla partita corrente.</w:t>
       </w:r>
     </w:p>
     <w:p>
@@ -8374,37 +8410,7 @@
         </w:numPr>
       </w:pPr>
       <w:r>
-        <w:t>Si setta</w:t>
-      </w:r>
-      <w:r>
-        <w:t xml:space="preserve"> </w:t>
-      </w:r>
-      <w:r>
-        <w:t>l</w:t>
-      </w:r>
-      <w:r>
-        <w:t>o</w:t>
-      </w:r>
-      <w:r>
-        <w:t xml:space="preserve"> </w:t>
-      </w:r>
-      <w:r>
-        <w:t>scenario</w:t>
-      </w:r>
-      <w:r>
-        <w:t xml:space="preserve"> che sar</w:t>
-      </w:r>
-      <w:r>
-        <w:t>à</w:t>
-      </w:r>
-      <w:r>
-        <w:t xml:space="preserve"> utilizzat</w:t>
-      </w:r>
-      <w:r>
-        <w:t>o</w:t>
-      </w:r>
-      <w:r>
-        <w:t xml:space="preserve"> dalla partita corrente.</w:t>
+        <w:t>Si setta lo scenario che sarà utilizzato dalla partita corrente.</w:t>
       </w:r>
     </w:p>
     <w:p>
@@ -8428,31 +8434,7 @@
         </w:numPr>
       </w:pPr>
       <w:r>
-        <w:t xml:space="preserve">Si </w:t>
-      </w:r>
-      <w:r>
-        <w:t>imposta</w:t>
-      </w:r>
-      <w:r>
-        <w:t xml:space="preserve"> </w:t>
-      </w:r>
-      <w:r>
-        <w:t>il dado</w:t>
-      </w:r>
-      <w:r>
-        <w:t xml:space="preserve"> che sar</w:t>
-      </w:r>
-      <w:r>
-        <w:t>à</w:t>
-      </w:r>
-      <w:r>
-        <w:t xml:space="preserve"> utilizzat</w:t>
-      </w:r>
-      <w:r>
-        <w:t>o</w:t>
-      </w:r>
-      <w:r>
-        <w:t xml:space="preserve"> dalla partita corrente.</w:t>
+        <w:t>Si imposta il dado che sarà utilizzato dalla partita corrente.</w:t>
       </w:r>
     </w:p>
     <w:p>
@@ -8476,25 +8458,7 @@
         </w:numPr>
       </w:pPr>
       <w:r>
-        <w:t>Si setta</w:t>
-      </w:r>
-      <w:r>
-        <w:t xml:space="preserve"> la pedina</w:t>
-      </w:r>
-      <w:r>
-        <w:t xml:space="preserve"> che sar</w:t>
-      </w:r>
-      <w:r>
-        <w:t>à</w:t>
-      </w:r>
-      <w:r>
-        <w:t xml:space="preserve"> utilizzat</w:t>
-      </w:r>
-      <w:r>
-        <w:t>a</w:t>
-      </w:r>
-      <w:r>
-        <w:t xml:space="preserve"> dalla partita corrente.</w:t>
+        <w:t>Si setta la pedina che sarà utilizzata dalla partita corrente.</w:t>
       </w:r>
     </w:p>
     <w:p>
@@ -8528,7 +8492,19 @@
         </w:rPr>
       </w:pPr>
       <w:r>
-        <w:t>Si accerta che la partita sia attivata correttamente</w:t>
+        <w:t>Ci si</w:t>
+      </w:r>
+      <w:r>
+        <w:t xml:space="preserve"> accerta che la partita sia </w:t>
+      </w:r>
+      <w:r>
+        <w:t xml:space="preserve">stata </w:t>
+      </w:r>
+      <w:r>
+        <w:t>attivata correttamente</w:t>
+      </w:r>
+      <w:r>
+        <w:t>.</w:t>
       </w:r>
     </w:p>
     <w:p>
@@ -11546,6 +11522,7 @@
     <w:rsid w:val="00696856"/>
     <w:rsid w:val="006C5C9A"/>
     <w:rsid w:val="00781888"/>
+    <w:rsid w:val="008A30D0"/>
     <w:rsid w:val="008C51CE"/>
     <w:rsid w:val="008D0E13"/>
     <w:rsid w:val="008E6C0C"/>
@@ -11553,6 +11530,7 @@
     <w:rsid w:val="00BA2BDF"/>
     <w:rsid w:val="00BE08AA"/>
     <w:rsid w:val="00CA6967"/>
+    <w:rsid w:val="00D122D6"/>
     <w:rsid w:val="00F435A7"/>
     <w:rsid w:val="00FF25BA"/>
   </w:rsids>

</xml_diff>

<commit_message>
aggiunta classe di test iterazione 2 + aggiornamento docx
</commit_message>
<xml_diff>
--- a/Documentazione/Elaborazione/Iterazione 1/Iterazione 1.docx
+++ b/Documentazione/Elaborazione/Iterazione 1/Iterazione 1.docx
@@ -3720,7 +3720,7 @@
           <w:szCs w:val="28"/>
         </w:rPr>
         <w:drawing>
-          <wp:inline distT="0" distB="0" distL="0" distR="0" wp14:anchorId="4989D762" wp14:editId="026A8321">
+          <wp:inline distT="0" distB="0" distL="0" distR="0" wp14:anchorId="4989D762" wp14:editId="41060628">
             <wp:extent cx="6120130" cy="3266440"/>
             <wp:effectExtent l="0" t="0" r="0" b="0"/>
             <wp:docPr id="118063030" name="Immagine 2" descr="Immagine che contiene testo, schermata, diagramma, linea"/>
@@ -7812,7 +7812,7 @@
           <w:shd w:val="clear" w:color="auto" w:fill="FFFFFF"/>
         </w:rPr>
         <w:drawing>
-          <wp:inline distT="0" distB="0" distL="0" distR="0" wp14:anchorId="69CEFF47" wp14:editId="74412662">
+          <wp:inline distT="0" distB="0" distL="0" distR="0" wp14:anchorId="69CEFF47" wp14:editId="0E572A7F">
             <wp:extent cx="6120130" cy="2586990"/>
             <wp:effectExtent l="0" t="0" r="0" b="3810"/>
             <wp:docPr id="1563156612" name="Immagine 5" descr="Immagine che contiene testo, diagramma, schermata, linea"/>
@@ -7903,7 +7903,7 @@
           <w:shd w:val="clear" w:color="auto" w:fill="FFFFFF"/>
         </w:rPr>
         <w:drawing>
-          <wp:inline distT="0" distB="0" distL="0" distR="0" wp14:anchorId="3A7F4745" wp14:editId="69AB8604">
+          <wp:inline distT="0" distB="0" distL="0" distR="0" wp14:anchorId="3A7F4745" wp14:editId="270F3B00">
             <wp:extent cx="6120130" cy="2659380"/>
             <wp:effectExtent l="0" t="0" r="0" b="7620"/>
             <wp:docPr id="448771579" name="Immagine 6" descr="Immagine che contiene testo, diagramma, schermata, linea"/>
@@ -8094,7 +8094,7 @@
           <w:shd w:val="clear" w:color="auto" w:fill="FFFFFF"/>
         </w:rPr>
         <w:drawing>
-          <wp:inline distT="0" distB="0" distL="0" distR="0" wp14:anchorId="77160A6D" wp14:editId="730A354B">
+          <wp:inline distT="0" distB="0" distL="0" distR="0" wp14:anchorId="77160A6D" wp14:editId="13B1CCEC">
             <wp:extent cx="6120130" cy="2486025"/>
             <wp:effectExtent l="0" t="0" r="0" b="9525"/>
             <wp:docPr id="547097666" name="Immagine 8" descr="Immagine che contiene testo, diagramma, linea, schermata"/>
@@ -8582,7 +8582,7 @@
           <w:szCs w:val="24"/>
         </w:rPr>
         <w:drawing>
-          <wp:inline distT="0" distB="0" distL="0" distR="0" wp14:anchorId="6059BA67" wp14:editId="16A92C03">
+          <wp:inline distT="0" distB="0" distL="0" distR="0" wp14:anchorId="6059BA67" wp14:editId="3B49A7A9">
             <wp:extent cx="6120130" cy="3122295"/>
             <wp:effectExtent l="0" t="0" r="0" b="1905"/>
             <wp:docPr id="1931516535" name="Immagine 13" descr="Immagine che contiene testo, diagramma, linea, Parallelo"/>
@@ -8821,11 +8821,24 @@
         </w:rPr>
       </w:pPr>
       <w:bookmarkStart w:id="12" w:name="_Toc172061563"/>
-      <w:r>
-        <w:rPr>
-          <w:rFonts w:ascii="Calibri" w:hAnsi="Calibri" w:cs="Calibri"/>
-        </w:rPr>
-        <w:t>6. Testing</w:t>
+      <w:bookmarkStart w:id="13" w:name="_Hlk197556711"/>
+      <w:r>
+        <w:rPr>
+          <w:rFonts w:ascii="Calibri" w:hAnsi="Calibri" w:cs="Calibri"/>
+        </w:rPr>
+        <w:t>6.</w:t>
+      </w:r>
+      <w:r>
+        <w:rPr>
+          <w:rFonts w:ascii="Calibri" w:hAnsi="Calibri" w:cs="Calibri"/>
+        </w:rPr>
+        <w:t>0</w:t>
+      </w:r>
+      <w:r>
+        <w:rPr>
+          <w:rFonts w:ascii="Calibri" w:hAnsi="Calibri" w:cs="Calibri"/>
+        </w:rPr>
+        <w:t xml:space="preserve"> Testing</w:t>
       </w:r>
       <w:bookmarkEnd w:id="12"/>
     </w:p>
@@ -8865,6 +8878,7 @@
         <w:t>.</w:t>
       </w:r>
     </w:p>
+    <w:bookmarkEnd w:id="13"/>
     <w:p>
       <w:pPr>
         <w:pStyle w:val="NormaleWeb"/>
@@ -12236,6 +12250,7 @@
     <w:sig w:usb0="20000287" w:usb1="00000003" w:usb2="00000000" w:usb3="00000000" w:csb0="0000019F" w:csb1="00000000"/>
   </w:font>
   <w:font w:name="Calibri">
+    <w:altName w:val="Calibri"/>
     <w:panose1 w:val="020F0502020204030204"/>
     <w:charset w:val="00"/>
     <w:family w:val="swiss"/>
@@ -12279,8 +12294,10 @@
     <w:rsid w:val="00451481"/>
     <w:rsid w:val="005E049C"/>
     <w:rsid w:val="006058B6"/>
+    <w:rsid w:val="00615AA4"/>
     <w:rsid w:val="00696856"/>
     <w:rsid w:val="006C5C9A"/>
+    <w:rsid w:val="006E1E24"/>
     <w:rsid w:val="00781888"/>
     <w:rsid w:val="008A30D0"/>
     <w:rsid w:val="008C51CE"/>

</xml_diff>

<commit_message>
fix documentazione completa + fix doc it 1
</commit_message>
<xml_diff>
--- a/Documentazione/Elaborazione/Iterazione 1/Iterazione 1.docx
+++ b/Documentazione/Elaborazione/Iterazione 1/Iterazione 1.docx
@@ -286,7 +286,7 @@
                                         <w:sz w:val="28"/>
                                         <w:szCs w:val="28"/>
                                       </w:rPr>
-                                      <w:t>[Data]</w:t>
+                                      <w:t xml:space="preserve">     </w:t>
                                     </w:r>
                                   </w:p>
                                 </w:sdtContent>
@@ -420,7 +420,7 @@
                                   <w:sz w:val="28"/>
                                   <w:szCs w:val="28"/>
                                 </w:rPr>
-                                <w:t>[Data]</w:t>
+                                <w:t xml:space="preserve">     </w:t>
                               </w:r>
                             </w:p>
                           </w:sdtContent>
@@ -580,7 +580,7 @@
             </w:rPr>
             <w:fldChar w:fldCharType="separate"/>
           </w:r>
-          <w:hyperlink w:anchor="_Toc172061552" w:history="1">
+          <w:hyperlink w:anchor="_Toc214297638" w:history="1">
             <w:r>
               <w:rPr>
                 <w:rStyle w:val="Collegamentoipertestuale"/>
@@ -627,7 +627,7 @@
                 <w:noProof/>
                 <w:webHidden/>
               </w:rPr>
-              <w:instrText xml:space="preserve"> PAGEREF _Toc172061552 \h </w:instrText>
+              <w:instrText xml:space="preserve"> PAGEREF _Toc214297638 \h </w:instrText>
             </w:r>
             <w:r>
               <w:rPr>
@@ -673,7 +673,7 @@
               <w14:ligatures w14:val="standardContextual"/>
             </w:rPr>
           </w:pPr>
-          <w:hyperlink w:anchor="_Toc172061553" w:history="1">
+          <w:hyperlink w:anchor="_Toc214297639" w:history="1">
             <w:r>
               <w:rPr>
                 <w:rStyle w:val="Collegamentoipertestuale"/>
@@ -701,7 +701,7 @@
                 <w:noProof/>
                 <w:webHidden/>
               </w:rPr>
-              <w:instrText xml:space="preserve"> PAGEREF _Toc172061553 \h </w:instrText>
+              <w:instrText xml:space="preserve"> PAGEREF _Toc214297639 \h </w:instrText>
             </w:r>
             <w:r>
               <w:rPr>
@@ -721,7 +721,7 @@
                 <w:noProof/>
                 <w:webHidden/>
               </w:rPr>
-              <w:t>1</w:t>
+              <w:t>2</w:t>
             </w:r>
             <w:r>
               <w:rPr>
@@ -747,7 +747,7 @@
               <w14:ligatures w14:val="standardContextual"/>
             </w:rPr>
           </w:pPr>
-          <w:hyperlink w:anchor="_Toc172061554" w:history="1">
+          <w:hyperlink w:anchor="_Toc214297640" w:history="1">
             <w:r>
               <w:rPr>
                 <w:rStyle w:val="Collegamentoipertestuale"/>
@@ -775,7 +775,7 @@
                 <w:noProof/>
                 <w:webHidden/>
               </w:rPr>
-              <w:instrText xml:space="preserve"> PAGEREF _Toc172061554 \h </w:instrText>
+              <w:instrText xml:space="preserve"> PAGEREF _Toc214297640 \h </w:instrText>
             </w:r>
             <w:r>
               <w:rPr>
@@ -821,7 +821,7 @@
               <w14:ligatures w14:val="standardContextual"/>
             </w:rPr>
           </w:pPr>
-          <w:hyperlink w:anchor="_Toc172061555" w:history="1">
+          <w:hyperlink w:anchor="_Toc214297641" w:history="1">
             <w:r>
               <w:rPr>
                 <w:rStyle w:val="Collegamentoipertestuale"/>
@@ -850,7 +850,7 @@
                 <w:noProof/>
                 <w:webHidden/>
               </w:rPr>
-              <w:instrText xml:space="preserve"> PAGEREF _Toc172061555 \h </w:instrText>
+              <w:instrText xml:space="preserve"> PAGEREF _Toc214297641 \h </w:instrText>
             </w:r>
             <w:r>
               <w:rPr>
@@ -896,7 +896,7 @@
               <w14:ligatures w14:val="standardContextual"/>
             </w:rPr>
           </w:pPr>
-          <w:hyperlink w:anchor="_Toc172061556" w:history="1">
+          <w:hyperlink w:anchor="_Toc214297642" w:history="1">
             <w:r>
               <w:rPr>
                 <w:rStyle w:val="Collegamentoipertestuale"/>
@@ -924,7 +924,7 @@
                 <w:noProof/>
                 <w:webHidden/>
               </w:rPr>
-              <w:instrText xml:space="preserve"> PAGEREF _Toc172061556 \h </w:instrText>
+              <w:instrText xml:space="preserve"> PAGEREF _Toc214297642 \h </w:instrText>
             </w:r>
             <w:r>
               <w:rPr>
@@ -970,7 +970,7 @@
               <w14:ligatures w14:val="standardContextual"/>
             </w:rPr>
           </w:pPr>
-          <w:hyperlink w:anchor="_Toc172061557" w:history="1">
+          <w:hyperlink w:anchor="_Toc214297643" w:history="1">
             <w:r>
               <w:rPr>
                 <w:rStyle w:val="Collegamentoipertestuale"/>
@@ -998,7 +998,7 @@
                 <w:noProof/>
                 <w:webHidden/>
               </w:rPr>
-              <w:instrText xml:space="preserve"> PAGEREF _Toc172061557 \h </w:instrText>
+              <w:instrText xml:space="preserve"> PAGEREF _Toc214297643 \h </w:instrText>
             </w:r>
             <w:r>
               <w:rPr>
@@ -1044,7 +1044,7 @@
               <w14:ligatures w14:val="standardContextual"/>
             </w:rPr>
           </w:pPr>
-          <w:hyperlink w:anchor="_Toc172061558" w:history="1">
+          <w:hyperlink w:anchor="_Toc214297644" w:history="1">
             <w:r>
               <w:rPr>
                 <w:rStyle w:val="Collegamentoipertestuale"/>
@@ -1072,7 +1072,7 @@
                 <w:noProof/>
                 <w:webHidden/>
               </w:rPr>
-              <w:instrText xml:space="preserve"> PAGEREF _Toc172061558 \h </w:instrText>
+              <w:instrText xml:space="preserve"> PAGEREF _Toc214297644 \h </w:instrText>
             </w:r>
             <w:r>
               <w:rPr>
@@ -1118,7 +1118,7 @@
               <w14:ligatures w14:val="standardContextual"/>
             </w:rPr>
           </w:pPr>
-          <w:hyperlink w:anchor="_Toc172061559" w:history="1">
+          <w:hyperlink w:anchor="_Toc214297645" w:history="1">
             <w:r>
               <w:rPr>
                 <w:rStyle w:val="Collegamentoipertestuale"/>
@@ -1146,7 +1146,7 @@
                 <w:noProof/>
                 <w:webHidden/>
               </w:rPr>
-              <w:instrText xml:space="preserve"> PAGEREF _Toc172061559 \h </w:instrText>
+              <w:instrText xml:space="preserve"> PAGEREF _Toc214297645 \h </w:instrText>
             </w:r>
             <w:r>
               <w:rPr>
@@ -1192,7 +1192,7 @@
               <w14:ligatures w14:val="standardContextual"/>
             </w:rPr>
           </w:pPr>
-          <w:hyperlink w:anchor="_Toc172061560" w:history="1">
+          <w:hyperlink w:anchor="_Toc214297646" w:history="1">
             <w:r>
               <w:rPr>
                 <w:rStyle w:val="Collegamentoipertestuale"/>
@@ -1221,7 +1221,7 @@
                 <w:noProof/>
                 <w:webHidden/>
               </w:rPr>
-              <w:instrText xml:space="preserve"> PAGEREF _Toc172061560 \h </w:instrText>
+              <w:instrText xml:space="preserve"> PAGEREF _Toc214297646 \h </w:instrText>
             </w:r>
             <w:r>
               <w:rPr>
@@ -1267,7 +1267,7 @@
               <w14:ligatures w14:val="standardContextual"/>
             </w:rPr>
           </w:pPr>
-          <w:hyperlink w:anchor="_Toc172061561" w:history="1">
+          <w:hyperlink w:anchor="_Toc214297647" w:history="1">
             <w:r>
               <w:rPr>
                 <w:rStyle w:val="Collegamentoipertestuale"/>
@@ -1296,7 +1296,7 @@
                 <w:noProof/>
                 <w:webHidden/>
               </w:rPr>
-              <w:instrText xml:space="preserve"> PAGEREF _Toc172061561 \h </w:instrText>
+              <w:instrText xml:space="preserve"> PAGEREF _Toc214297647 \h </w:instrText>
             </w:r>
             <w:r>
               <w:rPr>
@@ -1342,7 +1342,7 @@
               <w14:ligatures w14:val="standardContextual"/>
             </w:rPr>
           </w:pPr>
-          <w:hyperlink w:anchor="_Toc172061562" w:history="1">
+          <w:hyperlink w:anchor="_Toc214297648" w:history="1">
             <w:r>
               <w:rPr>
                 <w:rStyle w:val="Collegamentoipertestuale"/>
@@ -1370,7 +1370,7 @@
                 <w:noProof/>
                 <w:webHidden/>
               </w:rPr>
-              <w:instrText xml:space="preserve"> PAGEREF _Toc172061562 \h </w:instrText>
+              <w:instrText xml:space="preserve"> PAGEREF _Toc214297648 \h </w:instrText>
             </w:r>
             <w:r>
               <w:rPr>
@@ -1416,14 +1416,14 @@
               <w14:ligatures w14:val="standardContextual"/>
             </w:rPr>
           </w:pPr>
-          <w:hyperlink w:anchor="_Toc172061563" w:history="1">
+          <w:hyperlink w:anchor="_Toc214297649" w:history="1">
             <w:r>
               <w:rPr>
                 <w:rStyle w:val="Collegamentoipertestuale"/>
                 <w:rFonts w:ascii="Calibri" w:hAnsi="Calibri" w:cs="Calibri"/>
                 <w:noProof/>
               </w:rPr>
-              <w:t>6. Testing</w:t>
+              <w:t>6.0 Testing</w:t>
             </w:r>
             <w:r>
               <w:rPr>
@@ -1444,7 +1444,7 @@
                 <w:noProof/>
                 <w:webHidden/>
               </w:rPr>
-              <w:instrText xml:space="preserve"> PAGEREF _Toc172061563 \h </w:instrText>
+              <w:instrText xml:space="preserve"> PAGEREF _Toc214297649 \h </w:instrText>
             </w:r>
             <w:r>
               <w:rPr>
@@ -1511,7 +1511,7 @@
           <w:rFonts w:ascii="Calibri" w:hAnsi="Calibri" w:cs="Calibri"/>
         </w:rPr>
       </w:pPr>
-      <w:bookmarkStart w:id="0" w:name="_Toc172061552"/>
+      <w:bookmarkStart w:id="0" w:name="_Toc214297638"/>
       <w:r>
         <w:rPr>
           <w:rFonts w:ascii="Calibri" w:hAnsi="Calibri" w:cs="Calibri"/>
@@ -1540,8 +1540,6 @@
         <w:rPr>
           <w:rFonts w:ascii="Calibri" w:eastAsia="Calibri" w:hAnsi="Calibri" w:cs="Calibri"/>
           <w:color w:val="0D0D0D"/>
-          <w:sz w:val="28"/>
-          <w:szCs w:val="28"/>
           <w:highlight w:val="white"/>
         </w:rPr>
       </w:pPr>
@@ -1549,8 +1547,6 @@
         <w:rPr>
           <w:rFonts w:ascii="Calibri" w:eastAsia="Calibri" w:hAnsi="Calibri" w:cs="Calibri"/>
           <w:color w:val="0D0D0D"/>
-          <w:sz w:val="28"/>
-          <w:szCs w:val="28"/>
           <w:highlight w:val="white"/>
         </w:rPr>
         <w:t xml:space="preserve">Una volta conclusa la fase di ideazione, è possibile avviare la fase di </w:t>
@@ -1560,8 +1556,6 @@
           <w:rFonts w:ascii="Calibri" w:eastAsia="Calibri" w:hAnsi="Calibri" w:cs="Calibri"/>
           <w:b/>
           <w:color w:val="0D0D0D"/>
-          <w:sz w:val="28"/>
-          <w:szCs w:val="28"/>
           <w:highlight w:val="white"/>
         </w:rPr>
         <w:t>elaborazione</w:t>
@@ -1570,8 +1564,6 @@
         <w:rPr>
           <w:rFonts w:ascii="Calibri" w:eastAsia="Calibri" w:hAnsi="Calibri" w:cs="Calibri"/>
           <w:color w:val="0D0D0D"/>
-          <w:sz w:val="28"/>
-          <w:szCs w:val="28"/>
           <w:highlight w:val="white"/>
         </w:rPr>
         <w:t>, dando il via a una serie di iterazioni mirate a definire ulteriormente il progetto. Lo scopo di tali iterazioni sarà quello di sviluppare e testare l'architettura software principale, identificare e consolidare la maggior parte dei requisiti, nonché mitigare o eliminare i rischi principali.</w:t>
@@ -1590,16 +1582,12 @@
         <w:rPr>
           <w:rFonts w:ascii="Calibri" w:eastAsia="Calibri" w:hAnsi="Calibri" w:cs="Calibri"/>
           <w:color w:val="000000"/>
-          <w:sz w:val="28"/>
-          <w:szCs w:val="28"/>
         </w:rPr>
       </w:pPr>
       <w:r>
         <w:rPr>
           <w:rFonts w:ascii="Calibri" w:eastAsia="Calibri" w:hAnsi="Calibri" w:cs="Calibri"/>
           <w:color w:val="000000"/>
-          <w:sz w:val="28"/>
-          <w:szCs w:val="28"/>
         </w:rPr>
         <w:t xml:space="preserve">Nella prima iterazione verranno analizzati i seguenti requisiti: </w:t>
       </w:r>
@@ -1621,16 +1609,12 @@
         <w:rPr>
           <w:rFonts w:ascii="Calibri" w:eastAsia="Calibri" w:hAnsi="Calibri" w:cs="Calibri"/>
           <w:color w:val="000000"/>
-          <w:sz w:val="28"/>
-          <w:szCs w:val="28"/>
         </w:rPr>
       </w:pPr>
       <w:r>
         <w:rPr>
           <w:rFonts w:ascii="Calibri" w:eastAsia="Calibri" w:hAnsi="Calibri" w:cs="Calibri"/>
           <w:color w:val="000000"/>
-          <w:sz w:val="28"/>
-          <w:szCs w:val="28"/>
         </w:rPr>
         <w:t xml:space="preserve">Implementazione dello scenario principale di successo del caso d’uso </w:t>
       </w:r>
@@ -1639,8 +1623,6 @@
           <w:rFonts w:ascii="Calibri" w:eastAsia="Calibri" w:hAnsi="Calibri" w:cs="Calibri"/>
           <w:i/>
           <w:color w:val="000000"/>
-          <w:sz w:val="28"/>
-          <w:szCs w:val="28"/>
         </w:rPr>
         <w:t xml:space="preserve">UC1: </w:t>
       </w:r>
@@ -1649,8 +1631,6 @@
           <w:rFonts w:ascii="Calibri" w:eastAsia="Calibri" w:hAnsi="Calibri" w:cs="Calibri"/>
           <w:i/>
           <w:color w:val="0D0D0D"/>
-          <w:sz w:val="28"/>
-          <w:szCs w:val="28"/>
           <w:highlight w:val="white"/>
         </w:rPr>
         <w:t xml:space="preserve">Configurazione e avvio partita </w:t>
@@ -1661,8 +1641,6 @@
           <w:rFonts w:ascii="Calibri" w:eastAsia="Calibri" w:hAnsi="Calibri" w:cs="Calibri"/>
           <w:i/>
           <w:color w:val="0D0D0D"/>
-          <w:sz w:val="28"/>
-          <w:szCs w:val="28"/>
           <w:highlight w:val="white"/>
         </w:rPr>
         <w:t>singleplayer</w:t>
@@ -1672,8 +1650,6 @@
         <w:rPr>
           <w:rFonts w:ascii="Calibri" w:eastAsia="Calibri" w:hAnsi="Calibri" w:cs="Calibri"/>
           <w:color w:val="000000"/>
-          <w:sz w:val="28"/>
-          <w:szCs w:val="28"/>
         </w:rPr>
         <w:t xml:space="preserve">. </w:t>
       </w:r>
@@ -1695,16 +1671,12 @@
         <w:rPr>
           <w:rFonts w:ascii="Calibri" w:eastAsia="Calibri" w:hAnsi="Calibri" w:cs="Calibri"/>
           <w:color w:val="000000"/>
-          <w:sz w:val="28"/>
-          <w:szCs w:val="28"/>
         </w:rPr>
       </w:pPr>
       <w:r>
         <w:rPr>
           <w:rFonts w:ascii="Calibri" w:eastAsia="Calibri" w:hAnsi="Calibri" w:cs="Calibri"/>
           <w:color w:val="000000"/>
-          <w:sz w:val="28"/>
-          <w:szCs w:val="28"/>
         </w:rPr>
         <w:t xml:space="preserve">Implementazione di un caso d’uso di </w:t>
       </w:r>
@@ -1713,8 +1685,6 @@
           <w:rFonts w:ascii="Calibri" w:eastAsia="Calibri" w:hAnsi="Calibri" w:cs="Calibri"/>
           <w:i/>
           <w:color w:val="000000"/>
-          <w:sz w:val="28"/>
-          <w:szCs w:val="28"/>
         </w:rPr>
         <w:t>Gioco dell’Oca</w:t>
       </w:r>
@@ -1722,8 +1692,6 @@
         <w:rPr>
           <w:rFonts w:ascii="Calibri" w:eastAsia="Calibri" w:hAnsi="Calibri" w:cs="Calibri"/>
           <w:color w:val="000000"/>
-          <w:sz w:val="28"/>
-          <w:szCs w:val="28"/>
         </w:rPr>
         <w:t xml:space="preserve"> necessario per gestire le esigenze di inizializzazione per questa iterazione. </w:t>
       </w:r>
@@ -1739,17 +1707,36 @@
     </w:p>
     <w:p>
       <w:pPr>
+        <w:rPr>
+          <w:rFonts w:ascii="Calibri" w:eastAsia="Calibri" w:hAnsi="Calibri" w:cs="Calibri"/>
+          <w:sz w:val="56"/>
+          <w:szCs w:val="56"/>
+        </w:rPr>
+      </w:pPr>
+    </w:p>
+    <w:p>
+      <w:pPr>
+        <w:rPr>
+          <w:rFonts w:ascii="Calibri" w:eastAsia="Calibri" w:hAnsi="Calibri" w:cs="Calibri"/>
+          <w:sz w:val="56"/>
+          <w:szCs w:val="56"/>
+        </w:rPr>
+      </w:pPr>
+    </w:p>
+    <w:p>
+      <w:pPr>
         <w:pStyle w:val="Titolo1"/>
         <w:jc w:val="center"/>
         <w:rPr>
           <w:rFonts w:ascii="Calibri" w:hAnsi="Calibri" w:cs="Calibri"/>
         </w:rPr>
       </w:pPr>
-      <w:bookmarkStart w:id="1" w:name="_Toc172061553"/>
-      <w:r>
-        <w:rPr>
-          <w:rFonts w:ascii="Calibri" w:hAnsi="Calibri" w:cs="Calibri"/>
-        </w:rPr>
+      <w:bookmarkStart w:id="1" w:name="_Toc214297639"/>
+      <w:r>
+        <w:rPr>
+          <w:rFonts w:ascii="Calibri" w:hAnsi="Calibri" w:cs="Calibri"/>
+        </w:rPr>
+        <w:lastRenderedPageBreak/>
         <w:t xml:space="preserve">2.0 Caso d’uso UC1: Configurazione e avvio partita </w:t>
       </w:r>
       <w:proofErr w:type="spellStart"/>
@@ -1781,7 +1768,6 @@
           <w:rFonts w:ascii="Calibri" w:hAnsi="Calibri" w:cs="Calibri"/>
           <w:highlight w:val="white"/>
         </w:rPr>
-        <w:lastRenderedPageBreak/>
         <w:t xml:space="preserve">Di seguito viene riportato nel dettaglio il caso d’uso UC1: </w:t>
       </w:r>
       <w:r>
@@ -1827,20 +1813,6 @@
       </w:r>
       <w:bookmarkStart w:id="2" w:name="_heading=h.gjdgxs" w:colFirst="0" w:colLast="0"/>
       <w:bookmarkEnd w:id="2"/>
-    </w:p>
-    <w:p>
-      <w:pPr>
-        <w:rPr>
-          <w:rFonts w:ascii="Calibri" w:hAnsi="Calibri" w:cs="Calibri"/>
-        </w:rPr>
-      </w:pPr>
-    </w:p>
-    <w:p>
-      <w:pPr>
-        <w:rPr>
-          <w:rFonts w:ascii="Calibri" w:hAnsi="Calibri" w:cs="Calibri"/>
-        </w:rPr>
-      </w:pPr>
     </w:p>
     <w:p>
       <w:pPr>
@@ -1889,6 +1861,7 @@
                 <w:b/>
               </w:rPr>
             </w:pPr>
+            <w:bookmarkStart w:id="3" w:name="_Hlk214297769"/>
             <w:r>
               <w:rPr>
                 <w:rFonts w:ascii="Calibri" w:hAnsi="Calibri" w:cs="Calibri"/>
@@ -2581,6 +2554,7 @@
                 <w:rFonts w:ascii="Calibri" w:eastAsia="Calibri" w:hAnsi="Calibri" w:cs="Calibri"/>
                 <w:highlight w:val="white"/>
               </w:rPr>
+              <w:lastRenderedPageBreak/>
               <w:t>Il giocatore clicca sul pulsante “Avvia partita” e il sistema inizializza la sessione di gioco con le configurazioni precedentemente scelte.</w:t>
             </w:r>
           </w:p>
@@ -3220,6 +3194,7 @@
           </w:p>
         </w:tc>
       </w:tr>
+      <w:bookmarkEnd w:id="3"/>
     </w:tbl>
     <w:p>
       <w:pPr>
@@ -3236,7 +3211,7 @@
           <w:rFonts w:ascii="Calibri" w:hAnsi="Calibri" w:cs="Calibri"/>
         </w:rPr>
       </w:pPr>
-      <w:bookmarkStart w:id="3" w:name="_Toc172061554"/>
+      <w:bookmarkStart w:id="4" w:name="_Toc214297640"/>
       <w:r>
         <w:rPr>
           <w:rFonts w:ascii="Calibri" w:hAnsi="Calibri" w:cs="Calibri"/>
@@ -3244,7 +3219,7 @@
         <w:lastRenderedPageBreak/>
         <w:t>3.0 Analisi Orientata agli Oggetti</w:t>
       </w:r>
-      <w:bookmarkEnd w:id="3"/>
+      <w:bookmarkEnd w:id="4"/>
     </w:p>
     <w:p>
       <w:pPr>
@@ -3358,7 +3333,7 @@
           <w:highlight w:val="white"/>
         </w:rPr>
       </w:pPr>
-      <w:bookmarkStart w:id="4" w:name="_Toc172061555"/>
+      <w:bookmarkStart w:id="5" w:name="_Toc214297641"/>
       <w:r>
         <w:rPr>
           <w:rFonts w:ascii="Calibri" w:hAnsi="Calibri" w:cs="Calibri"/>
@@ -3366,7 +3341,7 @@
         </w:rPr>
         <w:t>3.1 Modello di Dominio</w:t>
       </w:r>
-      <w:bookmarkEnd w:id="4"/>
+      <w:bookmarkEnd w:id="5"/>
     </w:p>
     <w:p>
       <w:pPr>
@@ -3720,7 +3695,7 @@
           <w:szCs w:val="28"/>
         </w:rPr>
         <w:drawing>
-          <wp:inline distT="0" distB="0" distL="0" distR="0" wp14:anchorId="4989D762" wp14:editId="41060628">
+          <wp:inline distT="0" distB="0" distL="0" distR="0" wp14:anchorId="4989D762" wp14:editId="1CF04A2E">
             <wp:extent cx="6120130" cy="3266440"/>
             <wp:effectExtent l="0" t="0" r="0" b="0"/>
             <wp:docPr id="118063030" name="Immagine 2" descr="Immagine che contiene testo, schermata, diagramma, linea"/>
@@ -3782,7 +3757,7 @@
           <w:szCs w:val="40"/>
         </w:rPr>
       </w:pPr>
-      <w:bookmarkStart w:id="5" w:name="_Toc172061556"/>
+      <w:bookmarkStart w:id="6" w:name="_Toc214297642"/>
       <w:r>
         <w:rPr>
           <w:rFonts w:ascii="Calibri" w:hAnsi="Calibri" w:cs="Calibri"/>
@@ -3791,7 +3766,7 @@
         </w:rPr>
         <w:t>3.2 Diagramma di Sequenza di Sistema</w:t>
       </w:r>
-      <w:bookmarkEnd w:id="5"/>
+      <w:bookmarkEnd w:id="6"/>
     </w:p>
     <w:p>
       <w:pPr>
@@ -3915,7 +3890,7 @@
           <w:rFonts w:ascii="Calibri" w:hAnsi="Calibri" w:cs="Calibri"/>
         </w:rPr>
       </w:pPr>
-      <w:bookmarkStart w:id="6" w:name="_Toc172061557"/>
+      <w:bookmarkStart w:id="7" w:name="_Toc214297643"/>
       <w:r>
         <w:rPr>
           <w:rFonts w:ascii="Calibri" w:hAnsi="Calibri" w:cs="Calibri"/>
@@ -3925,7 +3900,7 @@
         <w:lastRenderedPageBreak/>
         <w:t>3.3 Contratti delle operazioni</w:t>
       </w:r>
-      <w:bookmarkEnd w:id="6"/>
+      <w:bookmarkEnd w:id="7"/>
     </w:p>
     <w:p>
       <w:pPr>
@@ -7634,7 +7609,7 @@
           <w:rFonts w:ascii="Calibri" w:hAnsi="Calibri" w:cs="Calibri"/>
         </w:rPr>
       </w:pPr>
-      <w:bookmarkStart w:id="7" w:name="_Toc172061558"/>
+      <w:bookmarkStart w:id="8" w:name="_Toc214297644"/>
       <w:r>
         <w:rPr>
           <w:rFonts w:ascii="Calibri" w:hAnsi="Calibri" w:cs="Calibri"/>
@@ -7660,7 +7635,7 @@
         </w:rPr>
         <w:t xml:space="preserve"> Orientata agli Oggetti</w:t>
       </w:r>
-      <w:bookmarkEnd w:id="7"/>
+      <w:bookmarkEnd w:id="8"/>
     </w:p>
     <w:p/>
     <w:p>
@@ -7773,14 +7748,14 @@
           <w:shd w:val="clear" w:color="auto" w:fill="FFFFFF"/>
         </w:rPr>
       </w:pPr>
-      <w:bookmarkStart w:id="8" w:name="_Toc172061559"/>
+      <w:bookmarkStart w:id="9" w:name="_Toc214297645"/>
       <w:r>
         <w:rPr>
           <w:shd w:val="clear" w:color="auto" w:fill="FFFFFF"/>
         </w:rPr>
         <w:t>4.1 Diagramma di Sequenza</w:t>
       </w:r>
-      <w:bookmarkEnd w:id="8"/>
+      <w:bookmarkEnd w:id="9"/>
     </w:p>
     <w:p>
       <w:r>
@@ -7812,7 +7787,7 @@
           <w:shd w:val="clear" w:color="auto" w:fill="FFFFFF"/>
         </w:rPr>
         <w:drawing>
-          <wp:inline distT="0" distB="0" distL="0" distR="0" wp14:anchorId="69CEFF47" wp14:editId="0E572A7F">
+          <wp:inline distT="0" distB="0" distL="0" distR="0" wp14:anchorId="69CEFF47" wp14:editId="120D227A">
             <wp:extent cx="6120130" cy="2586990"/>
             <wp:effectExtent l="0" t="0" r="0" b="3810"/>
             <wp:docPr id="1563156612" name="Immagine 5" descr="Immagine che contiene testo, diagramma, schermata, linea"/>
@@ -7903,7 +7878,7 @@
           <w:shd w:val="clear" w:color="auto" w:fill="FFFFFF"/>
         </w:rPr>
         <w:drawing>
-          <wp:inline distT="0" distB="0" distL="0" distR="0" wp14:anchorId="3A7F4745" wp14:editId="270F3B00">
+          <wp:inline distT="0" distB="0" distL="0" distR="0" wp14:anchorId="3A7F4745" wp14:editId="01862384">
             <wp:extent cx="6120130" cy="2659380"/>
             <wp:effectExtent l="0" t="0" r="0" b="7620"/>
             <wp:docPr id="448771579" name="Immagine 6" descr="Immagine che contiene testo, diagramma, schermata, linea"/>
@@ -8094,7 +8069,7 @@
           <w:shd w:val="clear" w:color="auto" w:fill="FFFFFF"/>
         </w:rPr>
         <w:drawing>
-          <wp:inline distT="0" distB="0" distL="0" distR="0" wp14:anchorId="77160A6D" wp14:editId="13B1CCEC">
+          <wp:inline distT="0" distB="0" distL="0" distR="0" wp14:anchorId="77160A6D" wp14:editId="01CF1C87">
             <wp:extent cx="6120130" cy="2486025"/>
             <wp:effectExtent l="0" t="0" r="0" b="9525"/>
             <wp:docPr id="547097666" name="Immagine 8" descr="Immagine che contiene testo, diagramma, linea, schermata"/>
@@ -8419,7 +8394,7 @@
           <w:highlight w:val="white"/>
         </w:rPr>
       </w:pPr>
-      <w:bookmarkStart w:id="9" w:name="_Toc172061560"/>
+      <w:bookmarkStart w:id="10" w:name="_Toc214297646"/>
       <w:r>
         <w:rPr>
           <w:rFonts w:ascii="Calibri" w:hAnsi="Calibri" w:cs="Calibri"/>
@@ -8456,7 +8431,7 @@
         </w:rPr>
         <w:t>Diagramma delle Classi</w:t>
       </w:r>
-      <w:bookmarkEnd w:id="9"/>
+      <w:bookmarkEnd w:id="10"/>
     </w:p>
     <w:p>
       <w:pPr>
@@ -8528,7 +8503,7 @@
           <w:highlight w:val="white"/>
         </w:rPr>
       </w:pPr>
-      <w:bookmarkStart w:id="10" w:name="_Toc172061561"/>
+      <w:bookmarkStart w:id="11" w:name="_Toc214297647"/>
       <w:r>
         <w:rPr>
           <w:rFonts w:ascii="Calibri" w:hAnsi="Calibri" w:cs="Calibri"/>
@@ -8564,7 +8539,7 @@
         </w:rPr>
         <w:t>Caso d’Uso di Avviamento</w:t>
       </w:r>
-      <w:bookmarkEnd w:id="10"/>
+      <w:bookmarkEnd w:id="11"/>
     </w:p>
     <w:p>
       <w:pPr>
@@ -8582,7 +8557,7 @@
           <w:szCs w:val="24"/>
         </w:rPr>
         <w:drawing>
-          <wp:inline distT="0" distB="0" distL="0" distR="0" wp14:anchorId="6059BA67" wp14:editId="3B49A7A9">
+          <wp:inline distT="0" distB="0" distL="0" distR="0" wp14:anchorId="6059BA67" wp14:editId="58CE6A41">
             <wp:extent cx="6120130" cy="3122295"/>
             <wp:effectExtent l="0" t="0" r="0" b="1905"/>
             <wp:docPr id="1931516535" name="Immagine 13" descr="Immagine che contiene testo, diagramma, linea, Parallelo"/>
@@ -8669,7 +8644,7 @@
           <w:u w:val="single"/>
         </w:rPr>
       </w:pPr>
-      <w:bookmarkStart w:id="11" w:name="_Toc172061562"/>
+      <w:bookmarkStart w:id="12" w:name="_Toc214297648"/>
       <w:r>
         <w:rPr>
           <w:rFonts w:ascii="Calibri" w:hAnsi="Calibri" w:cs="Calibri"/>
@@ -8689,7 +8664,7 @@
         </w:rPr>
         <w:t>Implementazione</w:t>
       </w:r>
-      <w:bookmarkEnd w:id="11"/>
+      <w:bookmarkEnd w:id="12"/>
     </w:p>
     <w:p>
       <w:pPr>
@@ -8820,8 +8795,8 @@
           <w:rFonts w:ascii="Calibri" w:hAnsi="Calibri" w:cs="Calibri"/>
         </w:rPr>
       </w:pPr>
-      <w:bookmarkStart w:id="12" w:name="_Toc172061563"/>
       <w:bookmarkStart w:id="13" w:name="_Hlk197556711"/>
+      <w:bookmarkStart w:id="14" w:name="_Toc214297649"/>
       <w:r>
         <w:rPr>
           <w:rFonts w:ascii="Calibri" w:hAnsi="Calibri" w:cs="Calibri"/>
@@ -8840,7 +8815,7 @@
         </w:rPr>
         <w:t xml:space="preserve"> Testing</w:t>
       </w:r>
-      <w:bookmarkEnd w:id="12"/>
+      <w:bookmarkEnd w:id="14"/>
     </w:p>
     <w:p>
       <w:pPr>
@@ -9415,7 +9390,6 @@
           <w:tc>
             <w:tcPr>
               <w:tcW w:w="4686" w:type="dxa"/>
-              <w:shd w:val="clear" w:color="auto" w:fill="auto"/>
               <w:vAlign w:val="center"/>
             </w:tcPr>
             <w:p>
@@ -9444,7 +9418,6 @@
       <w:tc>
         <w:tcPr>
           <w:tcW w:w="4674" w:type="dxa"/>
-          <w:shd w:val="clear" w:color="auto" w:fill="auto"/>
           <w:vAlign w:val="center"/>
         </w:tcPr>
         <w:p>
@@ -12250,7 +12223,6 @@
     <w:sig w:usb0="20000287" w:usb1="00000003" w:usb2="00000000" w:usb3="00000000" w:csb0="0000019F" w:csb1="00000000"/>
   </w:font>
   <w:font w:name="Calibri">
-    <w:altName w:val="Calibri"/>
     <w:panose1 w:val="020F0502020204030204"/>
     <w:charset w:val="00"/>
     <w:family w:val="swiss"/>
@@ -12299,7 +12271,9 @@
     <w:rsid w:val="006C5C9A"/>
     <w:rsid w:val="006E1E24"/>
     <w:rsid w:val="00781888"/>
+    <w:rsid w:val="007B6BC2"/>
     <w:rsid w:val="008A30D0"/>
+    <w:rsid w:val="008B7299"/>
     <w:rsid w:val="008C51CE"/>
     <w:rsid w:val="008D0E13"/>
     <w:rsid w:val="008E6C0C"/>

</xml_diff>